<commit_message>
feat: initialize AI agent project structure
</commit_message>
<xml_diff>
--- a/docs/Healthcare_Bio_sLLM_사전계획서2.docx
+++ b/docs/Healthcare_Bio_sLLM_사전계획서2.docx
@@ -15,7 +15,29 @@
           <w:sz w:val="22"/>
           <w:szCs w:val="22"/>
         </w:rPr>
-        <w:t>Healthcare &amp; Bio sLLM 프로젝트 과정</w:t>
+        <w:t xml:space="preserve">Healthcare &amp; Bio </w:t>
+      </w:r>
+      <w:proofErr w:type="spellStart"/>
+      <w:r>
+        <w:rPr>
+          <w:b/>
+          <w:bCs/>
+          <w:color w:val="028090"/>
+          <w:sz w:val="22"/>
+          <w:szCs w:val="22"/>
+        </w:rPr>
+        <w:t>sLLM</w:t>
+      </w:r>
+      <w:proofErr w:type="spellEnd"/>
+      <w:r>
+        <w:rPr>
+          <w:b/>
+          <w:bCs/>
+          <w:color w:val="028090"/>
+          <w:sz w:val="22"/>
+          <w:szCs w:val="22"/>
+        </w:rPr>
+        <w:t xml:space="preserve"> 프로젝트 과정</w:t>
       </w:r>
     </w:p>
     <w:p>
@@ -73,12 +95,6 @@
         <w:gridCol w:w="7560"/>
       </w:tblGrid>
       <w:tr>
-        <w:tblPrEx>
-          <w:tblCellMar>
-            <w:top w:w="0" w:type="dxa"/>
-            <w:bottom w:w="0" w:type="dxa"/>
-          </w:tblCellMar>
-        </w:tblPrEx>
         <w:tc>
           <w:tcPr>
             <w:tcW w:w="1800" w:type="dxa"/>
@@ -124,27 +140,18 @@
             </w:tcMar>
           </w:tcPr>
           <w:p>
-            <w:pPr>
+            <w:proofErr w:type="spellStart"/>
+            <w:r>
               <w:rPr>
                 <w:rFonts w:hint="eastAsia"/>
               </w:rPr>
-            </w:pPr>
-            <w:r>
-              <w:rPr>
-                <w:rFonts w:hint="eastAsia"/>
-              </w:rPr>
               <w:t>김주빈</w:t>
             </w:r>
+            <w:proofErr w:type="spellEnd"/>
           </w:p>
         </w:tc>
       </w:tr>
       <w:tr>
-        <w:tblPrEx>
-          <w:tblCellMar>
-            <w:top w:w="0" w:type="dxa"/>
-            <w:bottom w:w="0" w:type="dxa"/>
-          </w:tblCellMar>
-        </w:tblPrEx>
         <w:tc>
           <w:tcPr>
             <w:tcW w:w="1800" w:type="dxa"/>
@@ -200,12 +207,6 @@
         </w:tc>
       </w:tr>
       <w:tr>
-        <w:tblPrEx>
-          <w:tblCellMar>
-            <w:top w:w="0" w:type="dxa"/>
-            <w:bottom w:w="0" w:type="dxa"/>
-          </w:tblCellMar>
-        </w:tblPrEx>
         <w:tc>
           <w:tcPr>
             <w:tcW w:w="1800" w:type="dxa"/>
@@ -251,11 +252,6 @@
             </w:tcMar>
           </w:tcPr>
           <w:p>
-            <w:pPr>
-              <w:rPr>
-                <w:rFonts w:hint="eastAsia"/>
-              </w:rPr>
-            </w:pPr>
             <w:r>
               <w:rPr>
                 <w:rFonts w:hint="eastAsia"/>
@@ -266,12 +262,6 @@
         </w:tc>
       </w:tr>
       <w:tr>
-        <w:tblPrEx>
-          <w:tblCellMar>
-            <w:top w:w="0" w:type="dxa"/>
-            <w:bottom w:w="0" w:type="dxa"/>
-          </w:tblCellMar>
-        </w:tblPrEx>
         <w:tc>
           <w:tcPr>
             <w:tcW w:w="1800" w:type="dxa"/>
@@ -321,7 +311,14 @@
               <w:rPr>
                 <w:color w:val="1F3A3D"/>
               </w:rPr>
-              <w:t xml:space="preserve">2026년  </w:t>
+              <w:t>2026</w:t>
+            </w:r>
+            <w:proofErr w:type="gramStart"/>
+            <w:r>
+              <w:rPr>
+                <w:color w:val="1F3A3D"/>
+              </w:rPr>
+              <w:t xml:space="preserve">년  </w:t>
             </w:r>
             <w:r>
               <w:rPr>
@@ -343,6 +340,7 @@
               </w:rPr>
               <w:t>23</w:t>
             </w:r>
+            <w:proofErr w:type="gramEnd"/>
             <w:r>
               <w:rPr>
                 <w:color w:val="1F3A3D"/>
@@ -389,12 +387,6 @@
         <w:gridCol w:w="9360"/>
       </w:tblGrid>
       <w:tr>
-        <w:tblPrEx>
-          <w:tblCellMar>
-            <w:top w:w="0" w:type="dxa"/>
-            <w:bottom w:w="0" w:type="dxa"/>
-          </w:tblCellMar>
-        </w:tblPrEx>
         <w:tc>
           <w:tcPr>
             <w:tcW w:w="9360" w:type="dxa"/>
@@ -477,7 +469,29 @@
                 <w:sz w:val="20"/>
                 <w:szCs w:val="20"/>
               </w:rPr>
-              <w:t xml:space="preserve">  ③ sLLM을 활용할 이유가 분명한가?</w:t>
+              <w:t xml:space="preserve">  ③ </w:t>
+            </w:r>
+            <w:proofErr w:type="spellStart"/>
+            <w:r>
+              <w:rPr>
+                <w:b/>
+                <w:bCs/>
+                <w:color w:val="028090"/>
+                <w:sz w:val="20"/>
+                <w:szCs w:val="20"/>
+              </w:rPr>
+              <w:t>sLLM</w:t>
+            </w:r>
+            <w:proofErr w:type="spellEnd"/>
+            <w:r>
+              <w:rPr>
+                <w:b/>
+                <w:bCs/>
+                <w:color w:val="028090"/>
+                <w:sz w:val="20"/>
+                <w:szCs w:val="20"/>
+              </w:rPr>
+              <w:t>을 활용할 이유가 분명한가?</w:t>
             </w:r>
           </w:p>
         </w:tc>
@@ -511,7 +525,29 @@
           <w:sz w:val="19"/>
           <w:szCs w:val="19"/>
         </w:rPr>
-        <w:t>개발하고 싶은 프로그램의 이름 또는 주제를 작성해 주세요. (예: 복약 안내 챗봇, 의료 논문 요약 도우미)</w:t>
+        <w:t xml:space="preserve">개발하고 싶은 프로그램의 이름 또는 주제를 작성해 주세요. (예: 복약 안내 </w:t>
+      </w:r>
+      <w:proofErr w:type="spellStart"/>
+      <w:r>
+        <w:rPr>
+          <w:i/>
+          <w:iCs/>
+          <w:color w:val="808080"/>
+          <w:sz w:val="19"/>
+          <w:szCs w:val="19"/>
+        </w:rPr>
+        <w:t>챗봇</w:t>
+      </w:r>
+      <w:proofErr w:type="spellEnd"/>
+      <w:r>
+        <w:rPr>
+          <w:i/>
+          <w:iCs/>
+          <w:color w:val="808080"/>
+          <w:sz w:val="19"/>
+          <w:szCs w:val="19"/>
+        </w:rPr>
+        <w:t>, 의료 논문 요약 도우미)</w:t>
       </w:r>
     </w:p>
     <w:tbl>
@@ -535,12 +571,6 @@
         <w:gridCol w:w="9360"/>
       </w:tblGrid>
       <w:tr>
-        <w:tblPrEx>
-          <w:tblCellMar>
-            <w:top w:w="0" w:type="dxa"/>
-            <w:bottom w:w="0" w:type="dxa"/>
-          </w:tblCellMar>
-        </w:tblPrEx>
         <w:tc>
           <w:tcPr>
             <w:tcW w:w="9360" w:type="dxa"/>
@@ -564,7 +594,34 @@
               </w:rPr>
             </w:pPr>
             <w:r>
-              <w:t>AI 감염관리 조사 지원 Agent: sLLM 및 RAG 기반 역학조사 의견서 자동 생성 시스템</w:t>
+              <w:rPr>
+                <w:b/>
+                <w:bCs/>
+              </w:rPr>
+              <w:t xml:space="preserve">현장 중심 AI 감염관리 조사 </w:t>
+            </w:r>
+            <w:proofErr w:type="gramStart"/>
+            <w:r>
+              <w:rPr>
+                <w:b/>
+                <w:bCs/>
+              </w:rPr>
+              <w:t>에이전트</w:t>
+            </w:r>
+            <w:r>
+              <w:t xml:space="preserve"> :</w:t>
+            </w:r>
+            <w:proofErr w:type="gramEnd"/>
+            <w:r>
+              <w:t xml:space="preserve"> 시공간 의료 데이터 융합 기반 </w:t>
+            </w:r>
+            <w:proofErr w:type="spellStart"/>
+            <w:r>
+              <w:t>sLLM·RAG</w:t>
+            </w:r>
+            <w:proofErr w:type="spellEnd"/>
+            <w:r>
+              <w:t xml:space="preserve"> 의사결정 지원 시스템</w:t>
             </w:r>
           </w:p>
         </w:tc>
@@ -575,7 +632,6 @@
         <w:pStyle w:val="1"/>
         <w:spacing w:before="360" w:after="60"/>
         <w:rPr>
-          <w:rFonts w:hint="eastAsia"/>
           <w:b/>
           <w:bCs/>
           <w:color w:val="028090"/>
@@ -593,10 +649,10 @@
           <w:szCs w:val="26"/>
         </w:rPr>
         <w:drawing>
-          <wp:inline distT="0" distB="0" distL="0" distR="0" wp14:anchorId="063AB3A0" wp14:editId="7157085F">
-            <wp:extent cx="5899150" cy="419100"/>
-            <wp:effectExtent l="0" t="0" r="6350" b="0"/>
-            <wp:docPr id="1305448519" name="그림 1"/>
+          <wp:inline distT="0" distB="0" distL="0" distR="0" wp14:anchorId="486433AF" wp14:editId="00A085F5">
+            <wp:extent cx="5899150" cy="527050"/>
+            <wp:effectExtent l="0" t="0" r="6350" b="6350"/>
+            <wp:docPr id="2092474321" name="그림 4"/>
             <wp:cNvGraphicFramePr>
               <a:graphicFrameLocks xmlns:a="http://schemas.openxmlformats.org/drawingml/2006/main" noChangeAspect="1"/>
             </wp:cNvGraphicFramePr>
@@ -604,7 +660,7 @@
               <a:graphicData uri="http://schemas.openxmlformats.org/drawingml/2006/picture">
                 <pic:pic xmlns:pic="http://schemas.openxmlformats.org/drawingml/2006/picture">
                   <pic:nvPicPr>
-                    <pic:cNvPr id="0" name="Picture 1"/>
+                    <pic:cNvPr id="0" name="Picture 4"/>
                     <pic:cNvPicPr>
                       <a:picLocks noChangeAspect="1" noChangeArrowheads="1"/>
                     </pic:cNvPicPr>
@@ -625,7 +681,7 @@
                   <pic:spPr bwMode="auto">
                     <a:xfrm>
                       <a:off x="0" y="0"/>
-                      <a:ext cx="5899150" cy="419100"/>
+                      <a:ext cx="5899150" cy="527050"/>
                     </a:xfrm>
                     <a:prstGeom prst="rect">
                       <a:avLst/>
@@ -670,7 +726,29 @@
           <w:sz w:val="19"/>
           <w:szCs w:val="19"/>
         </w:rPr>
-        <w:t>Healthcare 또는 Bio 분야에서 어떤 문제를 해결하고 싶은지, 왜 이 문제가 중요한지 작성해 주세요.</w:t>
+        <w:t xml:space="preserve">Healthcare 또는 Bio 분야에서 어떤 문제를 해결하고 </w:t>
+      </w:r>
+      <w:proofErr w:type="spellStart"/>
+      <w:r>
+        <w:rPr>
+          <w:i/>
+          <w:iCs/>
+          <w:color w:val="808080"/>
+          <w:sz w:val="19"/>
+          <w:szCs w:val="19"/>
+        </w:rPr>
+        <w:t>싶은지</w:t>
+      </w:r>
+      <w:proofErr w:type="spellEnd"/>
+      <w:r>
+        <w:rPr>
+          <w:i/>
+          <w:iCs/>
+          <w:color w:val="808080"/>
+          <w:sz w:val="19"/>
+          <w:szCs w:val="19"/>
+        </w:rPr>
+        <w:t>, 왜 이 문제가 중요한지 작성해 주세요.</w:t>
       </w:r>
     </w:p>
     <w:tbl>
@@ -694,12 +772,6 @@
         <w:gridCol w:w="9360"/>
       </w:tblGrid>
       <w:tr>
-        <w:tblPrEx>
-          <w:tblCellMar>
-            <w:top w:w="0" w:type="dxa"/>
-            <w:bottom w:w="0" w:type="dxa"/>
-          </w:tblCellMar>
-        </w:tblPrEx>
         <w:tc>
           <w:tcPr>
             <w:tcW w:w="9360" w:type="dxa"/>
@@ -719,25 +791,151 @@
           <w:p>
             <w:pPr>
               <w:rPr>
+                <w:b/>
+                <w:bCs/>
+              </w:rPr>
+            </w:pPr>
+            <w:r>
+              <w:rPr>
+                <w:b/>
+                <w:bCs/>
+              </w:rPr>
+              <w:t>문제의 배경: 파편화된 데이터와 수작업의 한계</w:t>
+            </w:r>
+          </w:p>
+          <w:p>
+            <w:r>
+              <w:t>병원 내 감염성 질환(결핵, MRSA, COVID-19 등)이 발생하면 감염관리 담당자는 EMR, 의사·간호 기록, 검사 결과, 병실 출입 기록 등 여러 시스템에 흩어진 데이터를 직접 확인하며 접촉자를 추적해야 합니다. 이 과정은 많은 시간이 소요될 뿐 아니라 긴급한 상황에서 신속한 대응을 어렵게 만들고 담당자의 업무 부담도 크게 증가시킵니다.</w:t>
+            </w:r>
+          </w:p>
+          <w:p>
+            <w:r>
+              <w:rPr>
                 <w:rFonts w:hint="eastAsia"/>
-              </w:rPr>
-            </w:pPr>
-            <w:r>
-              <w:t>병원 내 감염성 질환(결핵, MRSA, COVID-19 등) 발생 시, 감염관리 담당자는 환자의 동선과 접촉자를 파악하기 위해 EMR, 간호/의사 기록, 병실 이동 기록, 검사 일정 및 출입 기록 등 파편화된 시스템의 데이터를 일일이 수동으로 확인해야 합니다.</w:t>
-            </w:r>
-          </w:p>
-          <w:p>
-            <w:pPr>
+                <w:b/>
+                <w:bCs/>
+              </w:rPr>
+              <w:lastRenderedPageBreak/>
+              <w:t xml:space="preserve">- </w:t>
+            </w:r>
+            <w:r>
+              <w:rPr>
+                <w:b/>
+                <w:bCs/>
+              </w:rPr>
+              <w:t xml:space="preserve">핵심 문제 1: </w:t>
+            </w:r>
+            <w:r>
+              <w:rPr>
+                <w:b/>
+                <w:bCs/>
+              </w:rPr>
+              <w:t>공간 데이터와 의료 데이터가 함께 활용되지 못함</w:t>
+            </w:r>
+          </w:p>
+          <w:p>
+            <w:r>
+              <w:t>현재 감염관리 업무는 의료진의 텍스트 기록이나 개별 시스템 조회에 크게 의존합니다. 병동 내 공간 정보와 환자의 이동·출입 기록을 함께 분석하는 기능이 부족하여 담당자가 여러 정보를 직접 비교하며 접촉 여부를 판단해야 합니다.</w:t>
+            </w:r>
+          </w:p>
+          <w:p>
+            <w:r>
               <w:rPr>
                 <w:rFonts w:hint="eastAsia"/>
-              </w:rPr>
-            </w:pPr>
-            <w:r>
-              <w:t>이는 업무 소요 시간이 과도하게 발생하고 담당자의 피로도를 급증시키는 주요 원인입니다. 기존의 감염관리 시스템은 단순 접촉자 조회 및 감염 통계 기능만 제공할 뿐, 다수의 비정형 의료 문서를 종합하여 판단 근거와 적용 지침까지 포함한 '조사 의견서'를 작성해주지는 못합니다. 감</w:t>
-            </w:r>
-            <w:r>
-              <w:lastRenderedPageBreak/>
-              <w:t>염병 대응의 핵심은 '신속하고 정확한 초기 격리 및 검사 판단'에 있으므로, 이 과정의 인지적 부하를 줄이고 신속한 의사결정을 지원하는 자동화 솔루션이 임상 현장에서 필수적입니다.</w:t>
+                <w:b/>
+                <w:bCs/>
+              </w:rPr>
+              <w:t xml:space="preserve">- </w:t>
+            </w:r>
+            <w:r>
+              <w:rPr>
+                <w:b/>
+                <w:bCs/>
+              </w:rPr>
+              <w:t xml:space="preserve">핵심 문제 2: </w:t>
+            </w:r>
+            <w:r>
+              <w:rPr>
+                <w:b/>
+                <w:bCs/>
+              </w:rPr>
+              <w:t>조사 의견서를 직접 작성해야 하는 업무 부담</w:t>
+            </w:r>
+          </w:p>
+          <w:p>
+            <w:r>
+              <w:t xml:space="preserve">현재 시스템은 </w:t>
+            </w:r>
+            <w:proofErr w:type="spellStart"/>
+            <w:r>
+              <w:t>접촉자</w:t>
+            </w:r>
+            <w:proofErr w:type="spellEnd"/>
+            <w:r>
+              <w:t xml:space="preserve"> 조회나 감염 통계 제공 기능은 있지만, 다양한 의료기록과 감염관리 지침을 종합하여 조사 의견서를 자동으로 작성해 주지는 않습니다. 따라서 담당자가 여러 자료를 검토한 뒤 직접 판단하고 문서를 작성해야 하는 부담이 있습니다.</w:t>
+            </w:r>
+          </w:p>
+          <w:p>
+            <w:pPr>
+              <w:rPr>
+                <w:b/>
+                <w:bCs/>
+              </w:rPr>
+            </w:pPr>
+          </w:p>
+          <w:p>
+            <w:pPr>
+              <w:rPr>
+                <w:rFonts w:hint="eastAsia"/>
+                <w:b/>
+                <w:bCs/>
+              </w:rPr>
+            </w:pPr>
+            <w:r>
+              <w:rPr>
+                <w:b/>
+                <w:bCs/>
+              </w:rPr>
+              <w:t>해결 방향</w:t>
+            </w:r>
+          </w:p>
+          <w:p>
+            <w:pPr>
+              <w:rPr>
+                <w:rFonts w:hint="eastAsia"/>
+              </w:rPr>
+            </w:pPr>
+            <w:r>
+              <w:t xml:space="preserve">본 프로젝트는 </w:t>
+            </w:r>
+            <w:proofErr w:type="spellStart"/>
+            <w:r>
+              <w:rPr>
+                <w:b/>
+                <w:bCs/>
+              </w:rPr>
+              <w:t>LangGraph</w:t>
+            </w:r>
+            <w:proofErr w:type="spellEnd"/>
+            <w:r>
+              <w:rPr>
+                <w:b/>
+                <w:bCs/>
+              </w:rPr>
+              <w:t xml:space="preserve"> 기반 AI Agent</w:t>
+            </w:r>
+            <w:r>
+              <w:t>가 의료기록, 병동 공간 데이터, 출입 로그, 감염관리 지침을 함께 활용하여 필요한 정보를 자동으로 조회하고(Tool Calling), 이를 바탕으로 접촉자를 분석하고 조사 의견서 초안을 생성하는 시스템을 목표로 합니다.</w:t>
+            </w:r>
+          </w:p>
+          <w:p>
+            <w:pPr>
+              <w:rPr>
+                <w:rFonts w:hint="eastAsia"/>
+              </w:rPr>
+            </w:pPr>
+            <w:r>
+              <w:t>이를 통해 감염관리 담당자의 반복적인 업무를 줄이고, 보다 빠르고 일관된 의사결정을 지원하고자 합니다.</w:t>
             </w:r>
           </w:p>
         </w:tc>
@@ -827,46 +1025,55 @@
             <w:pPr>
               <w:jc w:val="center"/>
               <w:rPr>
+                <w:rStyle w:val="aa"/>
+                <w:rFonts w:ascii="Arial" w:hAnsi="Arial" w:cs="Arial"/>
+              </w:rPr>
+            </w:pPr>
+            <w:r>
+              <w:rPr>
+                <w:rStyle w:val="aa"/>
+                <w:rFonts w:ascii="Arial" w:hAnsi="Arial" w:cs="Arial"/>
+              </w:rPr>
+              <w:t>AS-IS (</w:t>
+            </w:r>
+            <w:r>
+              <w:rPr>
+                <w:rStyle w:val="aa"/>
+                <w:rFonts w:ascii="Arial" w:hAnsi="Arial" w:cs="Arial"/>
+              </w:rPr>
+              <w:t>현재</w:t>
+            </w:r>
+            <w:r>
+              <w:rPr>
+                <w:rStyle w:val="aa"/>
+                <w:rFonts w:ascii="Arial" w:hAnsi="Arial" w:cs="Arial"/>
+              </w:rPr>
+              <w:t xml:space="preserve"> </w:t>
+            </w:r>
+            <w:r>
+              <w:rPr>
+                <w:rStyle w:val="aa"/>
+                <w:rFonts w:ascii="Arial" w:hAnsi="Arial" w:cs="Arial"/>
+              </w:rPr>
+              <w:t>수작업</w:t>
+            </w:r>
+            <w:r>
+              <w:rPr>
+                <w:rStyle w:val="aa"/>
+                <w:rFonts w:ascii="Arial" w:hAnsi="Arial" w:cs="Arial"/>
+              </w:rPr>
+              <w:t xml:space="preserve"> </w:t>
+            </w:r>
+          </w:p>
+          <w:p>
+            <w:pPr>
+              <w:jc w:val="center"/>
+              <w:rPr>
                 <w:b/>
                 <w:bCs/>
                 <w:color w:val="1F3A3D"/>
               </w:rPr>
             </w:pPr>
-            <w:r>
-              <w:rPr>
-                <w:rStyle w:val="aa"/>
-                <w:rFonts w:ascii="Arial" w:hAnsi="Arial" w:cs="Arial"/>
-              </w:rPr>
-              <w:t>AS-IS (</w:t>
-            </w:r>
-            <w:r>
-              <w:rPr>
-                <w:rStyle w:val="aa"/>
-                <w:rFonts w:ascii="Arial" w:hAnsi="Arial" w:cs="Arial"/>
-              </w:rPr>
-              <w:t>현재</w:t>
-            </w:r>
-            <w:r>
-              <w:rPr>
-                <w:rStyle w:val="aa"/>
-                <w:rFonts w:ascii="Arial" w:hAnsi="Arial" w:cs="Arial"/>
-              </w:rPr>
-              <w:t xml:space="preserve"> </w:t>
-            </w:r>
-            <w:r>
-              <w:rPr>
-                <w:rStyle w:val="aa"/>
-                <w:rFonts w:ascii="Arial" w:hAnsi="Arial" w:cs="Arial"/>
-              </w:rPr>
-              <w:t>수작업</w:t>
-            </w:r>
-            <w:r>
-              <w:rPr>
-                <w:rStyle w:val="aa"/>
-                <w:rFonts w:ascii="Arial" w:hAnsi="Arial" w:cs="Arial"/>
-              </w:rPr>
-              <w:t xml:space="preserve"> </w:t>
-            </w:r>
             <w:r>
               <w:rPr>
                 <w:rStyle w:val="aa"/>
@@ -1325,7 +1532,6 @@
           <w:p>
             <w:pPr>
               <w:rPr>
-                <w:rFonts w:hint="eastAsia"/>
                 <w:b/>
                 <w:bCs/>
                 <w:color w:val="1F3A3D"/>
@@ -1372,6 +1578,401 @@
                 <w:bCs/>
               </w:rPr>
               <w:t>단축</w:t>
+            </w:r>
+          </w:p>
+        </w:tc>
+      </w:tr>
+      <w:tr>
+        <w:trPr>
+          <w:trHeight w:val="913"/>
+        </w:trPr>
+        <w:tc>
+          <w:tcPr>
+            <w:tcW w:w="0" w:type="auto"/>
+            <w:tcBorders>
+              <w:top w:val="single" w:sz="6" w:space="0" w:color="CBD5E0"/>
+              <w:left w:val="single" w:sz="6" w:space="0" w:color="CBD5E0"/>
+              <w:bottom w:val="single" w:sz="6" w:space="0" w:color="CBD5E0"/>
+              <w:right w:val="single" w:sz="6" w:space="0" w:color="CBD5E0"/>
+            </w:tcBorders>
+            <w:shd w:val="clear" w:color="auto" w:fill="F2F2F2" w:themeFill="background1" w:themeFillShade="F2"/>
+            <w:tcMar>
+              <w:top w:w="150" w:type="dxa"/>
+              <w:left w:w="150" w:type="dxa"/>
+              <w:bottom w:w="150" w:type="dxa"/>
+              <w:right w:w="150" w:type="dxa"/>
+            </w:tcMar>
+            <w:vAlign w:val="center"/>
+          </w:tcPr>
+          <w:p>
+            <w:pPr>
+              <w:rPr>
+                <w:rFonts w:ascii="Arial" w:hAnsi="Arial" w:cs="Arial" w:hint="eastAsia"/>
+                <w:b/>
+                <w:bCs/>
+              </w:rPr>
+            </w:pPr>
+            <w:r>
+              <w:rPr>
+                <w:rFonts w:ascii="Arial" w:hAnsi="Arial" w:cs="Arial" w:hint="eastAsia"/>
+                <w:b/>
+                <w:bCs/>
+              </w:rPr>
+              <w:t>동선</w:t>
+            </w:r>
+            <w:r>
+              <w:rPr>
+                <w:rFonts w:ascii="Arial" w:hAnsi="Arial" w:cs="Arial" w:hint="eastAsia"/>
+                <w:b/>
+                <w:bCs/>
+              </w:rPr>
+              <w:t xml:space="preserve"> </w:t>
+            </w:r>
+            <w:r>
+              <w:rPr>
+                <w:rFonts w:ascii="Arial" w:hAnsi="Arial" w:cs="Arial" w:hint="eastAsia"/>
+                <w:b/>
+                <w:bCs/>
+              </w:rPr>
+              <w:t>분석</w:t>
+            </w:r>
+          </w:p>
+        </w:tc>
+        <w:tc>
+          <w:tcPr>
+            <w:tcW w:w="2583" w:type="dxa"/>
+            <w:tcBorders>
+              <w:top w:val="single" w:sz="6" w:space="0" w:color="CBD5E0"/>
+              <w:left w:val="single" w:sz="6" w:space="0" w:color="CBD5E0"/>
+              <w:bottom w:val="single" w:sz="6" w:space="0" w:color="CBD5E0"/>
+              <w:right w:val="single" w:sz="6" w:space="0" w:color="CBD5E0"/>
+            </w:tcBorders>
+            <w:tcMar>
+              <w:top w:w="150" w:type="dxa"/>
+              <w:left w:w="150" w:type="dxa"/>
+              <w:bottom w:w="150" w:type="dxa"/>
+              <w:right w:w="150" w:type="dxa"/>
+            </w:tcMar>
+            <w:vAlign w:val="center"/>
+          </w:tcPr>
+          <w:p>
+            <w:pPr>
+              <w:rPr>
+                <w:rFonts w:ascii="Arial" w:hAnsi="Arial" w:cs="Arial"/>
+              </w:rPr>
+            </w:pPr>
+            <w:r>
+              <w:rPr>
+                <w:rFonts w:ascii="Arial" w:hAnsi="Arial" w:cs="Arial" w:hint="eastAsia"/>
+              </w:rPr>
+              <w:t>담당자가</w:t>
+            </w:r>
+            <w:r>
+              <w:rPr>
+                <w:rFonts w:ascii="Arial" w:hAnsi="Arial" w:cs="Arial" w:hint="eastAsia"/>
+              </w:rPr>
+              <w:t xml:space="preserve"> </w:t>
+            </w:r>
+            <w:r>
+              <w:rPr>
+                <w:rFonts w:ascii="Arial" w:hAnsi="Arial" w:cs="Arial" w:hint="eastAsia"/>
+              </w:rPr>
+              <w:t>이동기록과</w:t>
+            </w:r>
+            <w:r>
+              <w:rPr>
+                <w:rFonts w:ascii="Arial" w:hAnsi="Arial" w:cs="Arial" w:hint="eastAsia"/>
+              </w:rPr>
+              <w:t xml:space="preserve"> </w:t>
+            </w:r>
+          </w:p>
+          <w:p>
+            <w:pPr>
+              <w:rPr>
+                <w:rFonts w:ascii="Arial" w:hAnsi="Arial" w:cs="Arial" w:hint="eastAsia"/>
+              </w:rPr>
+            </w:pPr>
+            <w:r>
+              <w:rPr>
+                <w:rFonts w:ascii="Arial" w:hAnsi="Arial" w:cs="Arial" w:hint="eastAsia"/>
+              </w:rPr>
+              <w:t>출입기록을</w:t>
+            </w:r>
+            <w:r>
+              <w:rPr>
+                <w:rFonts w:ascii="Arial" w:hAnsi="Arial" w:cs="Arial" w:hint="eastAsia"/>
+              </w:rPr>
+              <w:t xml:space="preserve"> </w:t>
+            </w:r>
+            <w:r>
+              <w:rPr>
+                <w:rFonts w:ascii="Arial" w:hAnsi="Arial" w:cs="Arial" w:hint="eastAsia"/>
+              </w:rPr>
+              <w:t>직접</w:t>
+            </w:r>
+            <w:r>
+              <w:rPr>
+                <w:rFonts w:ascii="Arial" w:hAnsi="Arial" w:cs="Arial" w:hint="eastAsia"/>
+              </w:rPr>
+              <w:t xml:space="preserve"> </w:t>
+            </w:r>
+            <w:r>
+              <w:rPr>
+                <w:rFonts w:ascii="Arial" w:hAnsi="Arial" w:cs="Arial" w:hint="eastAsia"/>
+              </w:rPr>
+              <w:t>비교</w:t>
+            </w:r>
+          </w:p>
+        </w:tc>
+        <w:tc>
+          <w:tcPr>
+            <w:tcW w:w="2835" w:type="dxa"/>
+            <w:tcBorders>
+              <w:top w:val="single" w:sz="6" w:space="0" w:color="CBD5E0"/>
+              <w:left w:val="single" w:sz="6" w:space="0" w:color="CBD5E0"/>
+              <w:bottom w:val="single" w:sz="6" w:space="0" w:color="CBD5E0"/>
+              <w:right w:val="single" w:sz="6" w:space="0" w:color="CBD5E0"/>
+            </w:tcBorders>
+            <w:tcMar>
+              <w:top w:w="150" w:type="dxa"/>
+              <w:left w:w="150" w:type="dxa"/>
+              <w:bottom w:w="150" w:type="dxa"/>
+              <w:right w:w="150" w:type="dxa"/>
+            </w:tcMar>
+            <w:vAlign w:val="center"/>
+          </w:tcPr>
+          <w:p>
+            <w:pPr>
+              <w:rPr>
+                <w:rFonts w:ascii="Arial" w:hAnsi="Arial" w:cs="Arial"/>
+              </w:rPr>
+            </w:pPr>
+            <w:r>
+              <w:rPr>
+                <w:rFonts w:ascii="Arial" w:hAnsi="Arial" w:cs="Arial" w:hint="eastAsia"/>
+              </w:rPr>
+              <w:t>AI Agent</w:t>
+            </w:r>
+            <w:r>
+              <w:rPr>
+                <w:rFonts w:ascii="Arial" w:hAnsi="Arial" w:cs="Arial" w:hint="eastAsia"/>
+              </w:rPr>
+              <w:t>가</w:t>
+            </w:r>
+            <w:r>
+              <w:rPr>
+                <w:rFonts w:ascii="Arial" w:hAnsi="Arial" w:cs="Arial" w:hint="eastAsia"/>
+              </w:rPr>
+              <w:t xml:space="preserve"> PostgreSQL </w:t>
+            </w:r>
+          </w:p>
+          <w:p>
+            <w:pPr>
+              <w:rPr>
+                <w:rFonts w:ascii="Arial" w:hAnsi="Arial" w:cs="Arial" w:hint="eastAsia"/>
+              </w:rPr>
+            </w:pPr>
+            <w:r>
+              <w:rPr>
+                <w:rFonts w:ascii="Arial" w:hAnsi="Arial" w:cs="Arial" w:hint="eastAsia"/>
+              </w:rPr>
+              <w:t>공간</w:t>
+            </w:r>
+            <w:r>
+              <w:rPr>
+                <w:rFonts w:ascii="Arial" w:hAnsi="Arial" w:cs="Arial" w:hint="eastAsia"/>
+              </w:rPr>
+              <w:t xml:space="preserve"> DB</w:t>
+            </w:r>
+            <w:r>
+              <w:rPr>
+                <w:rFonts w:ascii="Arial" w:hAnsi="Arial" w:cs="Arial" w:hint="eastAsia"/>
+              </w:rPr>
+              <w:t>와</w:t>
+            </w:r>
+            <w:r>
+              <w:rPr>
+                <w:rFonts w:ascii="Arial" w:hAnsi="Arial" w:cs="Arial" w:hint="eastAsia"/>
+              </w:rPr>
+              <w:t xml:space="preserve"> </w:t>
+            </w:r>
+            <w:r>
+              <w:rPr>
+                <w:rFonts w:ascii="Arial" w:hAnsi="Arial" w:cs="Arial" w:hint="eastAsia"/>
+              </w:rPr>
+              <w:t>출입</w:t>
+            </w:r>
+            <w:r>
+              <w:rPr>
+                <w:rFonts w:ascii="Arial" w:hAnsi="Arial" w:cs="Arial" w:hint="eastAsia"/>
+              </w:rPr>
+              <w:t xml:space="preserve"> </w:t>
+            </w:r>
+            <w:r>
+              <w:rPr>
+                <w:rFonts w:ascii="Arial" w:hAnsi="Arial" w:cs="Arial" w:hint="eastAsia"/>
+              </w:rPr>
+              <w:t>로그를</w:t>
+            </w:r>
+            <w:r>
+              <w:rPr>
+                <w:rFonts w:ascii="Arial" w:hAnsi="Arial" w:cs="Arial" w:hint="eastAsia"/>
+              </w:rPr>
+              <w:t xml:space="preserve"> Tool calling</w:t>
+            </w:r>
+            <w:r>
+              <w:rPr>
+                <w:rFonts w:ascii="Arial" w:hAnsi="Arial" w:cs="Arial" w:hint="eastAsia"/>
+              </w:rPr>
+              <w:t>으로</w:t>
+            </w:r>
+            <w:r>
+              <w:rPr>
+                <w:rFonts w:ascii="Arial" w:hAnsi="Arial" w:cs="Arial" w:hint="eastAsia"/>
+              </w:rPr>
+              <w:t xml:space="preserve"> </w:t>
+            </w:r>
+            <w:r>
+              <w:rPr>
+                <w:rFonts w:ascii="Arial" w:hAnsi="Arial" w:cs="Arial" w:hint="eastAsia"/>
+              </w:rPr>
+              <w:t>조회하여</w:t>
+            </w:r>
+            <w:r>
+              <w:rPr>
+                <w:rFonts w:ascii="Arial" w:hAnsi="Arial" w:cs="Arial" w:hint="eastAsia"/>
+              </w:rPr>
+              <w:t xml:space="preserve"> </w:t>
+            </w:r>
+            <w:r>
+              <w:rPr>
+                <w:rFonts w:ascii="Arial" w:hAnsi="Arial" w:cs="Arial" w:hint="eastAsia"/>
+              </w:rPr>
+              <w:t>접촉</w:t>
+            </w:r>
+            <w:r>
+              <w:rPr>
+                <w:rFonts w:ascii="Arial" w:hAnsi="Arial" w:cs="Arial" w:hint="eastAsia"/>
+              </w:rPr>
+              <w:t xml:space="preserve"> </w:t>
+            </w:r>
+            <w:r>
+              <w:rPr>
+                <w:rFonts w:ascii="Arial" w:hAnsi="Arial" w:cs="Arial" w:hint="eastAsia"/>
+              </w:rPr>
+              <w:t>후보</w:t>
+            </w:r>
+            <w:r>
+              <w:rPr>
+                <w:rFonts w:ascii="Arial" w:hAnsi="Arial" w:cs="Arial" w:hint="eastAsia"/>
+              </w:rPr>
+              <w:t xml:space="preserve"> </w:t>
+            </w:r>
+            <w:r>
+              <w:rPr>
+                <w:rFonts w:ascii="Arial" w:hAnsi="Arial" w:cs="Arial" w:hint="eastAsia"/>
+              </w:rPr>
+              <w:t>자동</w:t>
+            </w:r>
+            <w:r>
+              <w:rPr>
+                <w:rFonts w:ascii="Arial" w:hAnsi="Arial" w:cs="Arial" w:hint="eastAsia"/>
+              </w:rPr>
+              <w:t xml:space="preserve"> </w:t>
+            </w:r>
+            <w:r>
+              <w:rPr>
+                <w:rFonts w:ascii="Arial" w:hAnsi="Arial" w:cs="Arial" w:hint="eastAsia"/>
+              </w:rPr>
+              <w:t>식별</w:t>
+            </w:r>
+          </w:p>
+        </w:tc>
+        <w:tc>
+          <w:tcPr>
+            <w:tcW w:w="2210" w:type="dxa"/>
+            <w:tcBorders>
+              <w:top w:val="single" w:sz="6" w:space="0" w:color="CBD5E0"/>
+              <w:left w:val="single" w:sz="6" w:space="0" w:color="CBD5E0"/>
+              <w:bottom w:val="single" w:sz="6" w:space="0" w:color="CBD5E0"/>
+              <w:right w:val="single" w:sz="6" w:space="0" w:color="CBD5E0"/>
+            </w:tcBorders>
+            <w:vAlign w:val="center"/>
+          </w:tcPr>
+          <w:p>
+            <w:pPr>
+              <w:rPr>
+                <w:rFonts w:ascii="Arial" w:hAnsi="Arial" w:cs="Arial"/>
+                <w:b/>
+                <w:bCs/>
+              </w:rPr>
+            </w:pPr>
+            <w:proofErr w:type="spellStart"/>
+            <w:r>
+              <w:rPr>
+                <w:rFonts w:ascii="Arial" w:hAnsi="Arial" w:cs="Arial"/>
+                <w:b/>
+                <w:bCs/>
+              </w:rPr>
+              <w:t>접촉자</w:t>
+            </w:r>
+            <w:proofErr w:type="spellEnd"/>
+            <w:r>
+              <w:rPr>
+                <w:rFonts w:ascii="Arial" w:hAnsi="Arial" w:cs="Arial"/>
+                <w:b/>
+                <w:bCs/>
+              </w:rPr>
+              <w:t xml:space="preserve"> </w:t>
+            </w:r>
+            <w:r>
+              <w:rPr>
+                <w:rFonts w:ascii="Arial" w:hAnsi="Arial" w:cs="Arial"/>
+                <w:b/>
+                <w:bCs/>
+              </w:rPr>
+              <w:t>식별</w:t>
+            </w:r>
+            <w:r>
+              <w:rPr>
+                <w:rFonts w:ascii="Arial" w:hAnsi="Arial" w:cs="Arial"/>
+                <w:b/>
+                <w:bCs/>
+              </w:rPr>
+              <w:t xml:space="preserve"> </w:t>
+            </w:r>
+            <w:r>
+              <w:rPr>
+                <w:rFonts w:ascii="Arial" w:hAnsi="Arial" w:cs="Arial"/>
+                <w:b/>
+                <w:bCs/>
+              </w:rPr>
+              <w:t>정확도</w:t>
+            </w:r>
+            <w:r>
+              <w:rPr>
+                <w:rFonts w:ascii="Arial" w:hAnsi="Arial" w:cs="Arial"/>
+                <w:b/>
+                <w:bCs/>
+              </w:rPr>
+              <w:t xml:space="preserve"> </w:t>
+            </w:r>
+          </w:p>
+          <w:p>
+            <w:pPr>
+              <w:rPr>
+                <w:rFonts w:ascii="Arial" w:hAnsi="Arial" w:cs="Arial"/>
+                <w:b/>
+                <w:bCs/>
+              </w:rPr>
+            </w:pPr>
+            <w:r>
+              <w:rPr>
+                <w:rFonts w:ascii="Arial" w:hAnsi="Arial" w:cs="Arial"/>
+                <w:b/>
+                <w:bCs/>
+              </w:rPr>
+              <w:t>향상</w:t>
             </w:r>
           </w:p>
         </w:tc>
@@ -1695,7 +2296,6 @@
           <w:p>
             <w:pPr>
               <w:rPr>
-                <w:rFonts w:hint="eastAsia"/>
                 <w:b/>
                 <w:bCs/>
                 <w:color w:val="1F3A3D"/>
@@ -2050,7 +2650,6 @@
           <w:p>
             <w:pPr>
               <w:rPr>
-                <w:rFonts w:hint="eastAsia"/>
                 <w:b/>
                 <w:bCs/>
                 <w:color w:val="1F3A3D"/>
@@ -2191,11 +2790,6 @@
             <w:vAlign w:val="center"/>
           </w:tcPr>
           <w:p>
-            <w:pPr>
-              <w:rPr>
-                <w:rFonts w:hint="eastAsia"/>
-              </w:rPr>
-            </w:pPr>
             <w:r>
               <w:rPr>
                 <w:rFonts w:ascii="Arial" w:hAnsi="Arial" w:cs="Arial"/>
@@ -2296,7 +2890,6 @@
           <w:p>
             <w:pPr>
               <w:rPr>
-                <w:rFonts w:hint="eastAsia"/>
                 <w:b/>
                 <w:bCs/>
                 <w:color w:val="1F3A3D"/>
@@ -2410,7 +3003,6 @@
           <w:p>
             <w:pPr>
               <w:rPr>
-                <w:rFonts w:hint="eastAsia"/>
                 <w:b/>
                 <w:bCs/>
                 <w:color w:val="1F3A3D"/>
@@ -2467,7 +3059,6 @@
         <w:pStyle w:val="1"/>
         <w:spacing w:before="360" w:after="60"/>
         <w:rPr>
-          <w:rFonts w:hint="eastAsia"/>
           <w:b/>
           <w:bCs/>
           <w:color w:val="028090"/>
@@ -2528,12 +3119,6 @@
         <w:gridCol w:w="9360"/>
       </w:tblGrid>
       <w:tr>
-        <w:tblPrEx>
-          <w:tblCellMar>
-            <w:top w:w="0" w:type="dxa"/>
-            <w:bottom w:w="0" w:type="dxa"/>
-          </w:tblCellMar>
-        </w:tblPrEx>
         <w:tc>
           <w:tcPr>
             <w:tcW w:w="9360" w:type="dxa"/>
@@ -2574,7 +3159,44 @@
               <w:t>상황:</w:t>
             </w:r>
             <w:r>
-              <w:t xml:space="preserve"> 원내 특정 병동에서 다제내성균(CRE) 또는 호흡기 감염 환자가 발생하여, 즉각적인 노출자 추적과 위험도 평가, 격리 지시가 필요한 긴급한 상황</w:t>
+              <w:t xml:space="preserve"> </w:t>
+            </w:r>
+            <w:r>
+              <w:t xml:space="preserve">원내 특정 병동에서 </w:t>
+            </w:r>
+            <w:proofErr w:type="spellStart"/>
+            <w:r>
+              <w:t>다제내성균</w:t>
+            </w:r>
+            <w:proofErr w:type="spellEnd"/>
+            <w:r>
+              <w:t xml:space="preserve">(CRE), 결핵, COVID-19 등 감염성 질환이 발생하여 </w:t>
+            </w:r>
+            <w:r>
+              <w:rPr>
+                <w:b/>
+                <w:bCs/>
+              </w:rPr>
+              <w:t xml:space="preserve">단시간 내 </w:t>
+            </w:r>
+            <w:proofErr w:type="spellStart"/>
+            <w:r>
+              <w:rPr>
+                <w:b/>
+                <w:bCs/>
+              </w:rPr>
+              <w:t>접촉자</w:t>
+            </w:r>
+            <w:proofErr w:type="spellEnd"/>
+            <w:r>
+              <w:rPr>
+                <w:b/>
+                <w:bCs/>
+              </w:rPr>
+              <w:t xml:space="preserve"> 추적, 위험도 평가, 격리 여부 판단 및 조사 의견서 작성</w:t>
+            </w:r>
+            <w:r>
+              <w:t>이 필요한 긴급한 상황</w:t>
             </w:r>
           </w:p>
           <w:p>
@@ -2583,19 +3205,111 @@
                 <w:ilvl w:val="0"/>
                 <w:numId w:val="2"/>
               </w:numPr>
+            </w:pPr>
+            <w:r>
+              <w:rPr>
+                <w:b/>
+                <w:bCs/>
+              </w:rPr>
+              <w:t>요구사항:</w:t>
+            </w:r>
+            <w:r>
+              <w:t xml:space="preserve"> </w:t>
+            </w:r>
+          </w:p>
+          <w:p>
+            <w:pPr>
+              <w:numPr>
+                <w:ilvl w:val="1"/>
+                <w:numId w:val="2"/>
+              </w:numPr>
+            </w:pPr>
+            <w:r>
+              <w:t xml:space="preserve">EMR, 의사·간호 기록, 병동 출입 로그 등 여러 시스템에 분산된 정보를 </w:t>
+            </w:r>
+            <w:r>
+              <w:rPr>
+                <w:b/>
+                <w:bCs/>
+              </w:rPr>
+              <w:t>한 번에 확인</w:t>
+            </w:r>
+            <w:r>
+              <w:t>하고 싶다</w:t>
+            </w:r>
+            <w:r>
               <w:rPr>
                 <w:rFonts w:hint="eastAsia"/>
               </w:rPr>
-            </w:pPr>
-            <w:r>
-              <w:rPr>
-                <w:b/>
-                <w:bCs/>
-              </w:rPr>
-              <w:t>요구사항:</w:t>
-            </w:r>
-            <w:r>
-              <w:t xml:space="preserve"> 수많은 환자 기록을 단시간에 검토하고, 복잡한 원내 감염관리 SOP에 부합하는 조치 사항을 문서화하여 관련 부서에 배포해야 함 (시스템은 보조 역할을 수행하며, 최종 승인 권한 및 책임은 담당자가 가짐)</w:t>
+              <w:t>.</w:t>
+            </w:r>
+          </w:p>
+          <w:p>
+            <w:pPr>
+              <w:numPr>
+                <w:ilvl w:val="1"/>
+                <w:numId w:val="2"/>
+              </w:numPr>
+            </w:pPr>
+            <w:r>
+              <w:t xml:space="preserve">병동 공간 정보와 출입 로그를 기반으로 </w:t>
+            </w:r>
+            <w:r>
+              <w:rPr>
+                <w:b/>
+                <w:bCs/>
+              </w:rPr>
+              <w:t>밀접 접촉 가능 대상자를 빠르게 확인</w:t>
+            </w:r>
+            <w:r>
+              <w:t xml:space="preserve">하고 싶다. </w:t>
+            </w:r>
+          </w:p>
+          <w:p>
+            <w:pPr>
+              <w:numPr>
+                <w:ilvl w:val="1"/>
+                <w:numId w:val="2"/>
+              </w:numPr>
+            </w:pPr>
+            <w:r>
+              <w:t xml:space="preserve">병원 감염관리 SOP에 근거한 </w:t>
+            </w:r>
+            <w:r>
+              <w:rPr>
+                <w:b/>
+                <w:bCs/>
+              </w:rPr>
+              <w:t xml:space="preserve">조사 의견서 초안을 자동으로 </w:t>
+            </w:r>
+            <w:proofErr w:type="spellStart"/>
+            <w:r>
+              <w:rPr>
+                <w:b/>
+                <w:bCs/>
+              </w:rPr>
+              <w:t>생성</w:t>
+            </w:r>
+            <w:r>
+              <w:t>받고</w:t>
+            </w:r>
+            <w:proofErr w:type="spellEnd"/>
+            <w:r>
+              <w:t xml:space="preserve"> 싶다. </w:t>
+            </w:r>
+          </w:p>
+          <w:p>
+            <w:pPr>
+              <w:numPr>
+                <w:ilvl w:val="1"/>
+                <w:numId w:val="2"/>
+              </w:numPr>
+              <w:rPr>
+                <w:rFonts w:hint="eastAsia"/>
+              </w:rPr>
+            </w:pPr>
+            <w:r>
+              <w:t xml:space="preserve">최종 판단과 승인 권한은 담당자가 유지하면서, 반복적인 조사 업무를 AI가 보조해 주기를 원한다. </w:t>
             </w:r>
           </w:p>
         </w:tc>
@@ -2606,19 +3320,7 @@
         <w:pStyle w:val="1"/>
         <w:spacing w:before="360" w:after="60"/>
         <w:rPr>
-          <w:b/>
-          <w:bCs/>
-          <w:color w:val="028090"/>
-          <w:sz w:val="26"/>
-          <w:szCs w:val="26"/>
-        </w:rPr>
-      </w:pPr>
-    </w:p>
-    <w:p>
-      <w:pPr>
-        <w:pStyle w:val="1"/>
-        <w:spacing w:before="360" w:after="60"/>
-        <w:rPr>
+          <w:rFonts w:hint="eastAsia"/>
           <w:b/>
           <w:bCs/>
           <w:color w:val="028090"/>
@@ -2640,7 +3342,6 @@
           <w:sz w:val="26"/>
           <w:szCs w:val="26"/>
         </w:rPr>
-        <w:lastRenderedPageBreak/>
         <w:t>4. 주요 기능</w:t>
       </w:r>
     </w:p>
@@ -2681,12 +3382,6 @@
         <w:gridCol w:w="8160"/>
       </w:tblGrid>
       <w:tr>
-        <w:tblPrEx>
-          <w:tblCellMar>
-            <w:top w:w="0" w:type="dxa"/>
-            <w:bottom w:w="0" w:type="dxa"/>
-          </w:tblCellMar>
-        </w:tblPrEx>
         <w:tc>
           <w:tcPr>
             <w:tcW w:w="1200" w:type="dxa"/>
@@ -2734,37 +3429,48 @@
           <w:p>
             <w:pPr>
               <w:rPr>
-                <w:b/>
-                <w:bCs/>
-              </w:rPr>
-            </w:pPr>
-            <w:r>
-              <w:rPr>
-                <w:b/>
-                <w:bCs/>
-              </w:rPr>
-              <w:t>다중 비정형 의료 데이터 통합 및 관계 추론</w:t>
-            </w:r>
-          </w:p>
-          <w:p>
-            <w:pPr>
-              <w:rPr>
                 <w:rFonts w:hint="eastAsia"/>
-              </w:rPr>
-            </w:pPr>
-            <w:r>
-              <w:t>환자의 EMR, 간호/의사 기록, 이동 기록 등 다양한 포맷의 문서들을 종합적으로 분석하여 환자와 직·간접적으로 노출된 환자 및 의료진 명단을 식별</w:t>
+                <w:b/>
+                <w:bCs/>
+              </w:rPr>
+            </w:pPr>
+            <w:r>
+              <w:rPr>
+                <w:b/>
+                <w:bCs/>
+              </w:rPr>
+              <w:t>시공간 의료 데이터 융합 및 Agentic Tool Calling</w:t>
+            </w:r>
+          </w:p>
+          <w:p>
+            <w:proofErr w:type="spellStart"/>
+            <w:r>
+              <w:t>LangGraph</w:t>
+            </w:r>
+            <w:proofErr w:type="spellEnd"/>
+            <w:r>
+              <w:t xml:space="preserve"> 기반 AI Agent는 비정형 의료기록뿐 아니라 PostgreSQL에 저장된 병동 공간 메타데이터(POI)와 환자 출입 로그를 Tool Calling을 통해 자율적으로 조회. </w:t>
+            </w:r>
+          </w:p>
+          <w:p>
+            <w:pPr>
+              <w:rPr>
+                <w:rFonts w:hint="eastAsia"/>
+              </w:rPr>
+            </w:pPr>
+            <w:r>
+              <w:t>조회된 데이터를 종합하여 감염 노출 가능성이 있는 접촉 후보를 식별하고 이후 위험도 분석에 활</w:t>
+            </w:r>
+            <w:r>
+              <w:rPr>
+                <w:rFonts w:hint="eastAsia"/>
+              </w:rPr>
+              <w:t>용</w:t>
             </w:r>
           </w:p>
         </w:tc>
       </w:tr>
       <w:tr>
-        <w:tblPrEx>
-          <w:tblCellMar>
-            <w:top w:w="0" w:type="dxa"/>
-            <w:bottom w:w="0" w:type="dxa"/>
-          </w:tblCellMar>
-        </w:tblPrEx>
         <w:tc>
           <w:tcPr>
             <w:tcW w:w="1200" w:type="dxa"/>
@@ -2828,18 +3534,26 @@
               </w:rPr>
             </w:pPr>
             <w:r>
-              <w:t>병원 자체 감염관리 SOP 및 질병관리청 지침을 Vector DB화하여, 식별된 접촉자들의 감염 위험도(고위/중위/저위험)를 객관적 가이드라인에 근거하여 분류하고 자연어로 판단 이유를 설명</w:t>
+              <w:t>병원 자체 감염관리 SOP 및 질병관리청 지침을 Vector DB화하여, 식별된 접촉자들의 감염 위험도(고위/중위/</w:t>
+            </w:r>
+            <w:proofErr w:type="spellStart"/>
+            <w:r>
+              <w:t>저위험</w:t>
+            </w:r>
+            <w:proofErr w:type="spellEnd"/>
+            <w:r>
+              <w:t>)를 객관적 가이드라인에 근거하여 분류하고 자연어로 판단 이유</w:t>
+            </w:r>
+            <w:r>
+              <w:rPr>
+                <w:rFonts w:hint="eastAsia"/>
+              </w:rPr>
+              <w:t>와 근거가 된 SOP 문장을 함께 제시</w:t>
             </w:r>
           </w:p>
         </w:tc>
       </w:tr>
       <w:tr>
-        <w:tblPrEx>
-          <w:tblCellMar>
-            <w:top w:w="0" w:type="dxa"/>
-            <w:bottom w:w="0" w:type="dxa"/>
-          </w:tblCellMar>
-        </w:tblPrEx>
         <w:tc>
           <w:tcPr>
             <w:tcW w:w="1200" w:type="dxa"/>
@@ -2885,15 +3599,18 @@
             </w:tcMar>
           </w:tcPr>
           <w:p>
-            <w:r>
-              <w:rPr>
-                <w:b/>
-                <w:bCs/>
-              </w:rPr>
-              <w:t>감염관리 조사 의견서 자동 생성 및 Human-in-the-Loop 피드백</w:t>
-            </w:r>
-            <w:r>
-              <w:t xml:space="preserve"> </w:t>
+            <w:pPr>
+              <w:rPr>
+                <w:b/>
+                <w:bCs/>
+              </w:rPr>
+            </w:pPr>
+            <w:r>
+              <w:rPr>
+                <w:b/>
+                <w:bCs/>
+              </w:rPr>
+              <w:t>조사 의견서 생성 및 구조화된 결과 제공</w:t>
             </w:r>
           </w:p>
           <w:p>
@@ -2903,7 +3620,24 @@
               </w:rPr>
             </w:pPr>
             <w:r>
-              <w:t>추가 검사 및 격리 권고안이 포함된 '조사 의견서 초안'을 sLLM이 작성합니다. 담당자는 웹 대시보드에서 해당 초안과 근거 문헌을 검토(Review)하고 필요시 수정하여 최종 승인</w:t>
+              <w:t>담당자는 웹에서 검토 후 승</w:t>
+            </w:r>
+            <w:r>
+              <w:rPr>
+                <w:rFonts w:hint="eastAsia"/>
+              </w:rPr>
+              <w:t>인.</w:t>
+            </w:r>
+            <w:r>
+              <w:t xml:space="preserve"> 최종 결과는 JSON 형태로 </w:t>
+            </w:r>
+            <w:proofErr w:type="spellStart"/>
+            <w:r>
+              <w:t>구조화하여</w:t>
+            </w:r>
+            <w:proofErr w:type="spellEnd"/>
+            <w:r>
+              <w:t xml:space="preserve"> 저장하며 향후 의료정보 표준(FHIR) 기반 시스템과 연계 가능하도록 설계</w:t>
             </w:r>
           </w:p>
         </w:tc>
@@ -2929,6 +3663,7 @@
           <w:sz w:val="26"/>
           <w:szCs w:val="26"/>
         </w:rPr>
+        <w:lastRenderedPageBreak/>
         <w:t>① AI Agent Workflow (업무 중심</w:t>
       </w:r>
       <w:r>
@@ -2942,27 +3677,6 @@
         </w:rPr>
         <w:t>)</w:t>
       </w:r>
-    </w:p>
-    <w:p>
-      <w:pPr>
-        <w:pStyle w:val="1"/>
-        <w:spacing w:after="60"/>
-        <w:rPr>
-          <w:b/>
-          <w:bCs/>
-          <w:color w:val="028090"/>
-          <w:sz w:val="26"/>
-          <w:szCs w:val="26"/>
-        </w:rPr>
-      </w:pPr>
-      <w:r>
-        <w:rPr>
-          <w:color w:val="auto"/>
-          <w:sz w:val="21"/>
-          <w:szCs w:val="21"/>
-        </w:rPr>
-        <w:t>LangGraph 내부 7개 노드의 추론 논리, 데이터 처리 순서, HITL 피드백 루프 설명</w:t>
-      </w:r>
       <w:r>
         <w:rPr>
           <w:b/>
@@ -2973,10 +3687,10 @@
           <w:szCs w:val="26"/>
         </w:rPr>
         <w:drawing>
-          <wp:inline distT="0" distB="0" distL="0" distR="0" wp14:anchorId="5D96B15D" wp14:editId="360D4BD2">
-            <wp:extent cx="5894070" cy="576580"/>
-            <wp:effectExtent l="0" t="0" r="0" b="0"/>
-            <wp:docPr id="1841736510" name="그림 2"/>
+          <wp:inline distT="0" distB="0" distL="0" distR="0" wp14:anchorId="2A4F78A7" wp14:editId="63755A25">
+            <wp:extent cx="5904230" cy="2922905"/>
+            <wp:effectExtent l="0" t="0" r="1270" b="0"/>
+            <wp:docPr id="732087864" name="그림 1"/>
             <wp:cNvGraphicFramePr>
               <a:graphicFrameLocks xmlns:a="http://schemas.openxmlformats.org/drawingml/2006/main" noChangeAspect="1"/>
             </wp:cNvGraphicFramePr>
@@ -2984,7 +3698,7 @@
               <a:graphicData uri="http://schemas.openxmlformats.org/drawingml/2006/picture">
                 <pic:pic xmlns:pic="http://schemas.openxmlformats.org/drawingml/2006/picture">
                   <pic:nvPicPr>
-                    <pic:cNvPr id="0" name="Picture 2"/>
+                    <pic:cNvPr id="0" name="Picture 1"/>
                     <pic:cNvPicPr>
                       <a:picLocks noChangeAspect="1" noChangeArrowheads="1"/>
                     </pic:cNvPicPr>
@@ -3005,7 +3719,7 @@
                   <pic:spPr bwMode="auto">
                     <a:xfrm>
                       <a:off x="0" y="0"/>
-                      <a:ext cx="5894070" cy="576580"/>
+                      <a:ext cx="5904230" cy="2922905"/>
                     </a:xfrm>
                     <a:prstGeom prst="rect">
                       <a:avLst/>
@@ -3050,26 +3764,6 @@
         <w:pStyle w:val="1"/>
         <w:spacing w:after="60"/>
         <w:rPr>
-          <w:color w:val="auto"/>
-          <w:sz w:val="21"/>
-          <w:szCs w:val="21"/>
-        </w:rPr>
-      </w:pPr>
-      <w:r>
-        <w:rPr>
-          <w:color w:val="auto"/>
-          <w:sz w:val="21"/>
-          <w:szCs w:val="21"/>
-        </w:rPr>
-        <w:t>사용자 요청이 들어왔을 때 실시간(Online)으로 작동하는 서버·모델·DB 간 컴포넌트 통신 및 보안/관제 아키텍처 설명</w:t>
-      </w:r>
-    </w:p>
-    <w:p>
-      <w:pPr>
-        <w:pStyle w:val="1"/>
-        <w:spacing w:after="60"/>
-        <w:rPr>
-          <w:rFonts w:hint="eastAsia"/>
           <w:color w:val="028090"/>
           <w:sz w:val="26"/>
           <w:szCs w:val="26"/>
@@ -3083,10 +3777,10 @@
           <w:szCs w:val="21"/>
         </w:rPr>
         <w:drawing>
-          <wp:inline distT="0" distB="0" distL="0" distR="0" wp14:anchorId="3A0EA938" wp14:editId="3439D6F0">
-            <wp:extent cx="5894070" cy="2039620"/>
-            <wp:effectExtent l="0" t="0" r="0" b="0"/>
-            <wp:docPr id="1659234825" name="그림 3"/>
+          <wp:inline distT="0" distB="0" distL="0" distR="0" wp14:anchorId="5FB4208C" wp14:editId="7215778B">
+            <wp:extent cx="5892165" cy="3159125"/>
+            <wp:effectExtent l="0" t="0" r="0" b="3175"/>
+            <wp:docPr id="3279653" name="그림 2"/>
             <wp:cNvGraphicFramePr>
               <a:graphicFrameLocks xmlns:a="http://schemas.openxmlformats.org/drawingml/2006/main" noChangeAspect="1"/>
             </wp:cNvGraphicFramePr>
@@ -3094,7 +3788,7 @@
               <a:graphicData uri="http://schemas.openxmlformats.org/drawingml/2006/picture">
                 <pic:pic xmlns:pic="http://schemas.openxmlformats.org/drawingml/2006/picture">
                   <pic:nvPicPr>
-                    <pic:cNvPr id="0" name="Picture 3"/>
+                    <pic:cNvPr id="0" name="Picture 2"/>
                     <pic:cNvPicPr>
                       <a:picLocks noChangeAspect="1" noChangeArrowheads="1"/>
                     </pic:cNvPicPr>
@@ -3115,7 +3809,7 @@
                   <pic:spPr bwMode="auto">
                     <a:xfrm>
                       <a:off x="0" y="0"/>
-                      <a:ext cx="5894070" cy="2039620"/>
+                      <a:ext cx="5892165" cy="3159125"/>
                     </a:xfrm>
                     <a:prstGeom prst="rect">
                       <a:avLst/>
@@ -3188,38 +3882,17 @@
       </w:pPr>
       <w:r>
         <w:rPr>
-          <w:color w:val="auto"/>
-          <w:sz w:val="21"/>
-          <w:szCs w:val="21"/>
-        </w:rPr>
-        <w:t>SOP/지침 문서를 PDF로 읽어와 Chunking 후 Vector DB에 적재하는 오프라인 배치(Offline Batch ETL) 파이프라인 설명</w:t>
-      </w:r>
-    </w:p>
-    <w:p>
-      <w:pPr>
-        <w:pStyle w:val="1"/>
-        <w:spacing w:after="60"/>
-        <w:rPr>
-          <w:rFonts w:hint="eastAsia"/>
-          <w:color w:val="auto"/>
-          <w:sz w:val="21"/>
-          <w:szCs w:val="21"/>
-        </w:rPr>
-      </w:pPr>
-      <w:r>
-        <w:rPr>
           <w:rFonts w:hint="eastAsia"/>
           <w:noProof/>
           <w:color w:val="auto"/>
           <w:sz w:val="21"/>
           <w:szCs w:val="21"/>
         </w:rPr>
-        <w:lastRenderedPageBreak/>
         <w:drawing>
-          <wp:inline distT="0" distB="0" distL="0" distR="0" wp14:anchorId="0C9DF1E9" wp14:editId="6209FCF3">
-            <wp:extent cx="5908675" cy="1012825"/>
-            <wp:effectExtent l="0" t="0" r="0" b="0"/>
-            <wp:docPr id="45298348" name="그림 4"/>
+          <wp:inline distT="0" distB="0" distL="0" distR="0" wp14:anchorId="14B05920" wp14:editId="658A2B00">
+            <wp:extent cx="5899150" cy="869950"/>
+            <wp:effectExtent l="0" t="0" r="6350" b="6350"/>
+            <wp:docPr id="169088873" name="그림 3"/>
             <wp:cNvGraphicFramePr>
               <a:graphicFrameLocks xmlns:a="http://schemas.openxmlformats.org/drawingml/2006/main" noChangeAspect="1"/>
             </wp:cNvGraphicFramePr>
@@ -3227,7 +3900,7 @@
               <a:graphicData uri="http://schemas.openxmlformats.org/drawingml/2006/picture">
                 <pic:pic xmlns:pic="http://schemas.openxmlformats.org/drawingml/2006/picture">
                   <pic:nvPicPr>
-                    <pic:cNvPr id="0" name="Picture 4"/>
+                    <pic:cNvPr id="0" name="Picture 3"/>
                     <pic:cNvPicPr>
                       <a:picLocks noChangeAspect="1" noChangeArrowheads="1"/>
                     </pic:cNvPicPr>
@@ -3248,7 +3921,7 @@
                   <pic:spPr bwMode="auto">
                     <a:xfrm>
                       <a:off x="0" y="0"/>
-                      <a:ext cx="5908675" cy="1012825"/>
+                      <a:ext cx="5899150" cy="869950"/>
                     </a:xfrm>
                     <a:prstGeom prst="rect">
                       <a:avLst/>
@@ -3269,6 +3942,19 @@
       <w:pPr>
         <w:pStyle w:val="1"/>
         <w:spacing w:before="360" w:after="60"/>
+        <w:rPr>
+          <w:b/>
+          <w:bCs/>
+          <w:color w:val="028090"/>
+          <w:sz w:val="26"/>
+          <w:szCs w:val="26"/>
+        </w:rPr>
+      </w:pPr>
+    </w:p>
+    <w:p>
+      <w:pPr>
+        <w:pStyle w:val="1"/>
+        <w:spacing w:before="360" w:after="60"/>
       </w:pPr>
       <w:r>
         <w:rPr>
@@ -3278,6 +3964,7 @@
           <w:sz w:val="26"/>
           <w:szCs w:val="26"/>
         </w:rPr>
+        <w:lastRenderedPageBreak/>
         <w:t>5. 활용 데이터</w:t>
       </w:r>
     </w:p>
@@ -3294,6 +3981,1117 @@
           <w:szCs w:val="19"/>
         </w:rPr>
         <w:t>논문, 의료 문서, 바이오 데이터, 공개 데이터 등 활용하고 싶은 데이터와 확보 방법을 작성해 주세요.</w:t>
+      </w:r>
+    </w:p>
+    <w:tbl>
+      <w:tblPr>
+        <w:tblpPr w:leftFromText="142" w:rightFromText="142" w:vertAnchor="text" w:tblpY="369"/>
+        <w:tblW w:w="9348" w:type="dxa"/>
+        <w:tblCellMar>
+          <w:top w:w="15" w:type="dxa"/>
+          <w:left w:w="15" w:type="dxa"/>
+          <w:bottom w:w="15" w:type="dxa"/>
+          <w:right w:w="15" w:type="dxa"/>
+        </w:tblCellMar>
+        <w:tblLook w:val="04A0" w:firstRow="1" w:lastRow="0" w:firstColumn="1" w:lastColumn="0" w:noHBand="0" w:noVBand="1"/>
+      </w:tblPr>
+      <w:tblGrid>
+        <w:gridCol w:w="2544"/>
+        <w:gridCol w:w="3685"/>
+        <w:gridCol w:w="3119"/>
+      </w:tblGrid>
+      <w:tr>
+        <w:trPr>
+          <w:trHeight w:val="530"/>
+          <w:tblHeader/>
+        </w:trPr>
+        <w:tc>
+          <w:tcPr>
+            <w:tcW w:w="2544" w:type="dxa"/>
+            <w:tcBorders>
+              <w:top w:val="single" w:sz="6" w:space="0" w:color="CBD5E0"/>
+              <w:left w:val="single" w:sz="6" w:space="0" w:color="CBD5E0"/>
+              <w:bottom w:val="single" w:sz="6" w:space="0" w:color="CBD5E0"/>
+              <w:right w:val="single" w:sz="6" w:space="0" w:color="CBD5E0"/>
+            </w:tcBorders>
+            <w:shd w:val="clear" w:color="auto" w:fill="E8F4F5"/>
+            <w:tcMar>
+              <w:top w:w="150" w:type="dxa"/>
+              <w:left w:w="150" w:type="dxa"/>
+              <w:bottom w:w="150" w:type="dxa"/>
+              <w:right w:w="150" w:type="dxa"/>
+            </w:tcMar>
+            <w:vAlign w:val="center"/>
+            <w:hideMark/>
+          </w:tcPr>
+          <w:p>
+            <w:pPr>
+              <w:jc w:val="center"/>
+              <w:rPr>
+                <w:rFonts w:hint="eastAsia"/>
+                <w:b/>
+                <w:bCs/>
+              </w:rPr>
+            </w:pPr>
+            <w:r>
+              <w:rPr>
+                <w:rFonts w:hint="eastAsia"/>
+                <w:b/>
+                <w:bCs/>
+              </w:rPr>
+              <w:t>활용 데이터</w:t>
+            </w:r>
+          </w:p>
+        </w:tc>
+        <w:tc>
+          <w:tcPr>
+            <w:tcW w:w="3685" w:type="dxa"/>
+            <w:tcBorders>
+              <w:top w:val="single" w:sz="6" w:space="0" w:color="CBD5E0"/>
+              <w:left w:val="single" w:sz="6" w:space="0" w:color="CBD5E0"/>
+              <w:bottom w:val="single" w:sz="6" w:space="0" w:color="CBD5E0"/>
+              <w:right w:val="single" w:sz="6" w:space="0" w:color="CBD5E0"/>
+            </w:tcBorders>
+            <w:shd w:val="clear" w:color="auto" w:fill="E8F4F5"/>
+            <w:tcMar>
+              <w:top w:w="150" w:type="dxa"/>
+              <w:left w:w="150" w:type="dxa"/>
+              <w:bottom w:w="150" w:type="dxa"/>
+              <w:right w:w="150" w:type="dxa"/>
+            </w:tcMar>
+            <w:vAlign w:val="center"/>
+            <w:hideMark/>
+          </w:tcPr>
+          <w:p>
+            <w:pPr>
+              <w:jc w:val="center"/>
+              <w:rPr>
+                <w:b/>
+                <w:bCs/>
+                <w:color w:val="1F3A3D"/>
+              </w:rPr>
+            </w:pPr>
+            <w:r>
+              <w:rPr>
+                <w:rStyle w:val="aa"/>
+                <w:rFonts w:ascii="Arial" w:hAnsi="Arial" w:cs="Arial" w:hint="eastAsia"/>
+              </w:rPr>
+              <w:t>확보</w:t>
+            </w:r>
+            <w:r>
+              <w:rPr>
+                <w:rStyle w:val="aa"/>
+                <w:rFonts w:ascii="Arial" w:hAnsi="Arial" w:cs="Arial" w:hint="eastAsia"/>
+              </w:rPr>
+              <w:t xml:space="preserve"> </w:t>
+            </w:r>
+            <w:r>
+              <w:rPr>
+                <w:rStyle w:val="aa"/>
+                <w:rFonts w:hint="eastAsia"/>
+              </w:rPr>
+              <w:t>방법</w:t>
+            </w:r>
+          </w:p>
+        </w:tc>
+        <w:tc>
+          <w:tcPr>
+            <w:tcW w:w="3119" w:type="dxa"/>
+            <w:tcBorders>
+              <w:top w:val="single" w:sz="6" w:space="0" w:color="CBD5E0"/>
+              <w:left w:val="single" w:sz="6" w:space="0" w:color="CBD5E0"/>
+              <w:bottom w:val="single" w:sz="6" w:space="0" w:color="CBD5E0"/>
+              <w:right w:val="single" w:sz="6" w:space="0" w:color="CBD5E0"/>
+            </w:tcBorders>
+            <w:shd w:val="clear" w:color="auto" w:fill="E8F4F5"/>
+            <w:tcMar>
+              <w:top w:w="150" w:type="dxa"/>
+              <w:left w:w="150" w:type="dxa"/>
+              <w:bottom w:w="150" w:type="dxa"/>
+              <w:right w:w="150" w:type="dxa"/>
+            </w:tcMar>
+            <w:vAlign w:val="center"/>
+            <w:hideMark/>
+          </w:tcPr>
+          <w:p>
+            <w:pPr>
+              <w:jc w:val="center"/>
+              <w:rPr>
+                <w:rFonts w:hint="eastAsia"/>
+                <w:b/>
+                <w:bCs/>
+                <w:color w:val="1F3A3D"/>
+              </w:rPr>
+            </w:pPr>
+            <w:r>
+              <w:rPr>
+                <w:rFonts w:hint="eastAsia"/>
+                <w:b/>
+                <w:bCs/>
+              </w:rPr>
+              <w:t>활용 목적</w:t>
+            </w:r>
+          </w:p>
+        </w:tc>
+      </w:tr>
+      <w:tr>
+        <w:trPr>
+          <w:trHeight w:val="913"/>
+        </w:trPr>
+        <w:tc>
+          <w:tcPr>
+            <w:tcW w:w="2544" w:type="dxa"/>
+            <w:tcBorders>
+              <w:top w:val="single" w:sz="6" w:space="0" w:color="CBD5E0"/>
+              <w:left w:val="single" w:sz="6" w:space="0" w:color="CBD5E0"/>
+              <w:bottom w:val="single" w:sz="6" w:space="0" w:color="CBD5E0"/>
+              <w:right w:val="single" w:sz="6" w:space="0" w:color="CBD5E0"/>
+            </w:tcBorders>
+            <w:shd w:val="clear" w:color="auto" w:fill="F2F2F2" w:themeFill="background1" w:themeFillShade="F2"/>
+            <w:tcMar>
+              <w:top w:w="150" w:type="dxa"/>
+              <w:left w:w="150" w:type="dxa"/>
+              <w:bottom w:w="150" w:type="dxa"/>
+              <w:right w:w="150" w:type="dxa"/>
+            </w:tcMar>
+            <w:vAlign w:val="center"/>
+            <w:hideMark/>
+          </w:tcPr>
+          <w:p>
+            <w:pPr>
+              <w:rPr>
+                <w:rFonts w:hint="eastAsia"/>
+                <w:b/>
+                <w:bCs/>
+              </w:rPr>
+            </w:pPr>
+            <w:r>
+              <w:rPr>
+                <w:rFonts w:hint="eastAsia"/>
+                <w:b/>
+                <w:bCs/>
+              </w:rPr>
+              <w:t>질병관리청 감염관리 지침(PDF)</w:t>
+            </w:r>
+          </w:p>
+        </w:tc>
+        <w:tc>
+          <w:tcPr>
+            <w:tcW w:w="3685" w:type="dxa"/>
+            <w:tcBorders>
+              <w:top w:val="single" w:sz="6" w:space="0" w:color="CBD5E0"/>
+              <w:left w:val="single" w:sz="6" w:space="0" w:color="CBD5E0"/>
+              <w:bottom w:val="single" w:sz="6" w:space="0" w:color="CBD5E0"/>
+              <w:right w:val="single" w:sz="6" w:space="0" w:color="CBD5E0"/>
+            </w:tcBorders>
+            <w:tcMar>
+              <w:top w:w="150" w:type="dxa"/>
+              <w:left w:w="150" w:type="dxa"/>
+              <w:bottom w:w="150" w:type="dxa"/>
+              <w:right w:w="150" w:type="dxa"/>
+            </w:tcMar>
+            <w:vAlign w:val="center"/>
+            <w:hideMark/>
+          </w:tcPr>
+          <w:p>
+            <w:r>
+              <w:rPr>
+                <w:rFonts w:ascii="Arial" w:hAnsi="Arial" w:cs="Arial" w:hint="eastAsia"/>
+              </w:rPr>
+              <w:t>질병관리청</w:t>
+            </w:r>
+            <w:r>
+              <w:rPr>
+                <w:rFonts w:ascii="Arial" w:hAnsi="Arial" w:cs="Arial" w:hint="eastAsia"/>
+              </w:rPr>
+              <w:t xml:space="preserve"> </w:t>
+            </w:r>
+            <w:r>
+              <w:rPr>
+                <w:rFonts w:ascii="Arial" w:hAnsi="Arial" w:cs="Arial" w:hint="eastAsia"/>
+              </w:rPr>
+              <w:t>공개</w:t>
+            </w:r>
+            <w:r>
+              <w:rPr>
+                <w:rFonts w:ascii="Arial" w:hAnsi="Arial" w:cs="Arial" w:hint="eastAsia"/>
+              </w:rPr>
+              <w:t xml:space="preserve"> </w:t>
+            </w:r>
+            <w:r>
+              <w:rPr>
+                <w:rFonts w:ascii="Arial" w:hAnsi="Arial" w:cs="Arial" w:hint="eastAsia"/>
+              </w:rPr>
+              <w:t>자료</w:t>
+            </w:r>
+          </w:p>
+        </w:tc>
+        <w:tc>
+          <w:tcPr>
+            <w:tcW w:w="3119" w:type="dxa"/>
+            <w:tcBorders>
+              <w:top w:val="single" w:sz="6" w:space="0" w:color="CBD5E0"/>
+              <w:left w:val="single" w:sz="6" w:space="0" w:color="CBD5E0"/>
+              <w:bottom w:val="single" w:sz="6" w:space="0" w:color="CBD5E0"/>
+              <w:right w:val="single" w:sz="6" w:space="0" w:color="CBD5E0"/>
+            </w:tcBorders>
+            <w:tcMar>
+              <w:top w:w="150" w:type="dxa"/>
+              <w:left w:w="150" w:type="dxa"/>
+              <w:bottom w:w="150" w:type="dxa"/>
+              <w:right w:w="150" w:type="dxa"/>
+            </w:tcMar>
+            <w:vAlign w:val="center"/>
+            <w:hideMark/>
+          </w:tcPr>
+          <w:p>
+            <w:pPr>
+              <w:rPr>
+                <w:rFonts w:hint="eastAsia"/>
+                <w:b/>
+                <w:bCs/>
+                <w:color w:val="1F3A3D"/>
+                <w:sz w:val="20"/>
+                <w:szCs w:val="20"/>
+              </w:rPr>
+            </w:pPr>
+            <w:r>
+              <w:rPr>
+                <w:rFonts w:ascii="Arial" w:hAnsi="Arial" w:cs="Arial" w:hint="eastAsia"/>
+              </w:rPr>
+              <w:t>R</w:t>
+            </w:r>
+            <w:r>
+              <w:rPr>
+                <w:rFonts w:hint="eastAsia"/>
+              </w:rPr>
+              <w:t>AG 지식베이스 구축</w:t>
+            </w:r>
+          </w:p>
+        </w:tc>
+      </w:tr>
+      <w:tr>
+        <w:trPr>
+          <w:trHeight w:val="913"/>
+        </w:trPr>
+        <w:tc>
+          <w:tcPr>
+            <w:tcW w:w="2544" w:type="dxa"/>
+            <w:tcBorders>
+              <w:top w:val="single" w:sz="6" w:space="0" w:color="CBD5E0"/>
+              <w:left w:val="single" w:sz="6" w:space="0" w:color="CBD5E0"/>
+              <w:bottom w:val="single" w:sz="6" w:space="0" w:color="CBD5E0"/>
+              <w:right w:val="single" w:sz="6" w:space="0" w:color="CBD5E0"/>
+            </w:tcBorders>
+            <w:shd w:val="clear" w:color="auto" w:fill="F2F2F2" w:themeFill="background1" w:themeFillShade="F2"/>
+            <w:tcMar>
+              <w:top w:w="150" w:type="dxa"/>
+              <w:left w:w="150" w:type="dxa"/>
+              <w:bottom w:w="150" w:type="dxa"/>
+              <w:right w:w="150" w:type="dxa"/>
+            </w:tcMar>
+            <w:vAlign w:val="center"/>
+          </w:tcPr>
+          <w:p>
+            <w:pPr>
+              <w:rPr>
+                <w:rFonts w:ascii="Arial" w:hAnsi="Arial" w:cs="Arial"/>
+                <w:b/>
+                <w:bCs/>
+              </w:rPr>
+            </w:pPr>
+            <w:r>
+              <w:rPr>
+                <w:rFonts w:ascii="Arial" w:hAnsi="Arial" w:cs="Arial" w:hint="eastAsia"/>
+                <w:b/>
+                <w:bCs/>
+              </w:rPr>
+              <w:t>병원</w:t>
+            </w:r>
+            <w:r>
+              <w:rPr>
+                <w:rFonts w:ascii="Arial" w:hAnsi="Arial" w:cs="Arial" w:hint="eastAsia"/>
+                <w:b/>
+                <w:bCs/>
+              </w:rPr>
+              <w:t xml:space="preserve"> </w:t>
+            </w:r>
+            <w:r>
+              <w:rPr>
+                <w:rFonts w:ascii="Arial" w:hAnsi="Arial" w:cs="Arial" w:hint="eastAsia"/>
+                <w:b/>
+                <w:bCs/>
+              </w:rPr>
+              <w:t>감염관리</w:t>
+            </w:r>
+            <w:r>
+              <w:rPr>
+                <w:rFonts w:ascii="Arial" w:hAnsi="Arial" w:cs="Arial" w:hint="eastAsia"/>
+                <w:b/>
+                <w:bCs/>
+              </w:rPr>
+              <w:t xml:space="preserve"> SOP</w:t>
+            </w:r>
+          </w:p>
+          <w:p>
+            <w:pPr>
+              <w:rPr>
+                <w:rFonts w:ascii="Arial" w:hAnsi="Arial" w:cs="Arial" w:hint="eastAsia"/>
+                <w:b/>
+                <w:bCs/>
+              </w:rPr>
+            </w:pPr>
+            <w:r>
+              <w:rPr>
+                <w:rFonts w:ascii="Arial" w:hAnsi="Arial" w:cs="Arial" w:hint="eastAsia"/>
+                <w:b/>
+                <w:bCs/>
+              </w:rPr>
+              <w:t>(</w:t>
+            </w:r>
+            <w:r>
+              <w:rPr>
+                <w:rFonts w:ascii="Arial" w:hAnsi="Arial" w:cs="Arial" w:hint="eastAsia"/>
+                <w:b/>
+                <w:bCs/>
+              </w:rPr>
+              <w:t>가상</w:t>
+            </w:r>
+            <w:r>
+              <w:rPr>
+                <w:rFonts w:ascii="Arial" w:hAnsi="Arial" w:cs="Arial" w:hint="eastAsia"/>
+                <w:b/>
+                <w:bCs/>
+              </w:rPr>
+              <w:t>)</w:t>
+            </w:r>
+          </w:p>
+        </w:tc>
+        <w:tc>
+          <w:tcPr>
+            <w:tcW w:w="3685" w:type="dxa"/>
+            <w:tcBorders>
+              <w:top w:val="single" w:sz="6" w:space="0" w:color="CBD5E0"/>
+              <w:left w:val="single" w:sz="6" w:space="0" w:color="CBD5E0"/>
+              <w:bottom w:val="single" w:sz="6" w:space="0" w:color="CBD5E0"/>
+              <w:right w:val="single" w:sz="6" w:space="0" w:color="CBD5E0"/>
+            </w:tcBorders>
+            <w:tcMar>
+              <w:top w:w="150" w:type="dxa"/>
+              <w:left w:w="150" w:type="dxa"/>
+              <w:bottom w:w="150" w:type="dxa"/>
+              <w:right w:w="150" w:type="dxa"/>
+            </w:tcMar>
+            <w:vAlign w:val="center"/>
+          </w:tcPr>
+          <w:p>
+            <w:pPr>
+              <w:rPr>
+                <w:rFonts w:ascii="Arial" w:hAnsi="Arial" w:cs="Arial" w:hint="eastAsia"/>
+              </w:rPr>
+            </w:pPr>
+            <w:r>
+              <w:rPr>
+                <w:rFonts w:ascii="Arial" w:hAnsi="Arial" w:cs="Arial" w:hint="eastAsia"/>
+              </w:rPr>
+              <w:t>실제</w:t>
+            </w:r>
+            <w:r>
+              <w:rPr>
+                <w:rFonts w:ascii="Arial" w:hAnsi="Arial" w:cs="Arial" w:hint="eastAsia"/>
+              </w:rPr>
+              <w:t xml:space="preserve"> </w:t>
+            </w:r>
+            <w:r>
+              <w:rPr>
+                <w:rFonts w:ascii="Arial" w:hAnsi="Arial" w:cs="Arial" w:hint="eastAsia"/>
+              </w:rPr>
+              <w:t>병원</w:t>
+            </w:r>
+            <w:r>
+              <w:rPr>
+                <w:rFonts w:ascii="Arial" w:hAnsi="Arial" w:cs="Arial" w:hint="eastAsia"/>
+              </w:rPr>
+              <w:t xml:space="preserve"> SOP </w:t>
+            </w:r>
+            <w:r>
+              <w:rPr>
+                <w:rFonts w:ascii="Arial" w:hAnsi="Arial" w:cs="Arial" w:hint="eastAsia"/>
+              </w:rPr>
+              <w:t>형식을</w:t>
+            </w:r>
+            <w:r>
+              <w:rPr>
+                <w:rFonts w:ascii="Arial" w:hAnsi="Arial" w:cs="Arial" w:hint="eastAsia"/>
+              </w:rPr>
+              <w:t xml:space="preserve"> </w:t>
+            </w:r>
+            <w:r>
+              <w:rPr>
+                <w:rFonts w:ascii="Arial" w:hAnsi="Arial" w:cs="Arial" w:hint="eastAsia"/>
+              </w:rPr>
+              <w:t>참고하여</w:t>
+            </w:r>
+            <w:r>
+              <w:rPr>
+                <w:rFonts w:ascii="Arial" w:hAnsi="Arial" w:cs="Arial" w:hint="eastAsia"/>
+              </w:rPr>
+              <w:t xml:space="preserve"> </w:t>
+            </w:r>
+            <w:r>
+              <w:rPr>
+                <w:rFonts w:ascii="Arial" w:hAnsi="Arial" w:cs="Arial" w:hint="eastAsia"/>
+              </w:rPr>
+              <w:t>자체</w:t>
+            </w:r>
+            <w:r>
+              <w:rPr>
+                <w:rFonts w:ascii="Arial" w:hAnsi="Arial" w:cs="Arial" w:hint="eastAsia"/>
+              </w:rPr>
+              <w:t xml:space="preserve"> </w:t>
+            </w:r>
+            <w:r>
+              <w:rPr>
+                <w:rFonts w:ascii="Arial" w:hAnsi="Arial" w:cs="Arial" w:hint="eastAsia"/>
+              </w:rPr>
+              <w:t>작성</w:t>
+            </w:r>
+          </w:p>
+        </w:tc>
+        <w:tc>
+          <w:tcPr>
+            <w:tcW w:w="3119" w:type="dxa"/>
+            <w:tcBorders>
+              <w:top w:val="single" w:sz="6" w:space="0" w:color="CBD5E0"/>
+              <w:left w:val="single" w:sz="6" w:space="0" w:color="CBD5E0"/>
+              <w:bottom w:val="single" w:sz="6" w:space="0" w:color="CBD5E0"/>
+              <w:right w:val="single" w:sz="6" w:space="0" w:color="CBD5E0"/>
+            </w:tcBorders>
+            <w:tcMar>
+              <w:top w:w="150" w:type="dxa"/>
+              <w:left w:w="150" w:type="dxa"/>
+              <w:bottom w:w="150" w:type="dxa"/>
+              <w:right w:w="150" w:type="dxa"/>
+            </w:tcMar>
+            <w:vAlign w:val="center"/>
+          </w:tcPr>
+          <w:p>
+            <w:pPr>
+              <w:rPr>
+                <w:rFonts w:ascii="Arial" w:hAnsi="Arial" w:cs="Arial" w:hint="eastAsia"/>
+              </w:rPr>
+            </w:pPr>
+            <w:r>
+              <w:rPr>
+                <w:rFonts w:ascii="Arial" w:hAnsi="Arial" w:cs="Arial" w:hint="eastAsia"/>
+              </w:rPr>
+              <w:t>병원</w:t>
+            </w:r>
+            <w:r>
+              <w:rPr>
+                <w:rFonts w:ascii="Arial" w:hAnsi="Arial" w:cs="Arial" w:hint="eastAsia"/>
+              </w:rPr>
+              <w:t xml:space="preserve"> </w:t>
+            </w:r>
+            <w:r>
+              <w:rPr>
+                <w:rFonts w:ascii="Arial" w:hAnsi="Arial" w:cs="Arial" w:hint="eastAsia"/>
+              </w:rPr>
+              <w:t>내부</w:t>
+            </w:r>
+            <w:r>
+              <w:rPr>
+                <w:rFonts w:ascii="Arial" w:hAnsi="Arial" w:cs="Arial" w:hint="eastAsia"/>
+              </w:rPr>
+              <w:t xml:space="preserve"> </w:t>
+            </w:r>
+            <w:r>
+              <w:rPr>
+                <w:rFonts w:ascii="Arial" w:hAnsi="Arial" w:cs="Arial" w:hint="eastAsia"/>
+              </w:rPr>
+              <w:t>규정</w:t>
+            </w:r>
+            <w:r>
+              <w:rPr>
+                <w:rFonts w:ascii="Arial" w:hAnsi="Arial" w:cs="Arial" w:hint="eastAsia"/>
+              </w:rPr>
+              <w:t xml:space="preserve"> </w:t>
+            </w:r>
+            <w:r>
+              <w:rPr>
+                <w:rFonts w:ascii="Arial" w:hAnsi="Arial" w:cs="Arial" w:hint="eastAsia"/>
+              </w:rPr>
+              <w:t>반영</w:t>
+            </w:r>
+          </w:p>
+        </w:tc>
+      </w:tr>
+      <w:tr>
+        <w:trPr>
+          <w:trHeight w:val="1203"/>
+        </w:trPr>
+        <w:tc>
+          <w:tcPr>
+            <w:tcW w:w="2544" w:type="dxa"/>
+            <w:tcBorders>
+              <w:top w:val="single" w:sz="6" w:space="0" w:color="CBD5E0"/>
+              <w:left w:val="single" w:sz="6" w:space="0" w:color="CBD5E0"/>
+              <w:bottom w:val="single" w:sz="6" w:space="0" w:color="CBD5E0"/>
+              <w:right w:val="single" w:sz="6" w:space="0" w:color="CBD5E0"/>
+            </w:tcBorders>
+            <w:shd w:val="clear" w:color="auto" w:fill="F2F2F2" w:themeFill="background1" w:themeFillShade="F2"/>
+            <w:tcMar>
+              <w:top w:w="150" w:type="dxa"/>
+              <w:left w:w="150" w:type="dxa"/>
+              <w:bottom w:w="150" w:type="dxa"/>
+              <w:right w:w="150" w:type="dxa"/>
+            </w:tcMar>
+            <w:vAlign w:val="center"/>
+            <w:hideMark/>
+          </w:tcPr>
+          <w:p>
+            <w:pPr>
+              <w:rPr>
+                <w:rFonts w:hint="eastAsia"/>
+                <w:b/>
+                <w:bCs/>
+              </w:rPr>
+            </w:pPr>
+            <w:r>
+              <w:rPr>
+                <w:rFonts w:hint="eastAsia"/>
+                <w:b/>
+                <w:bCs/>
+              </w:rPr>
+              <w:t>가상 환자 임상 데이터</w:t>
+            </w:r>
+          </w:p>
+        </w:tc>
+        <w:tc>
+          <w:tcPr>
+            <w:tcW w:w="3685" w:type="dxa"/>
+            <w:tcBorders>
+              <w:top w:val="single" w:sz="6" w:space="0" w:color="CBD5E0"/>
+              <w:left w:val="single" w:sz="6" w:space="0" w:color="CBD5E0"/>
+              <w:bottom w:val="single" w:sz="6" w:space="0" w:color="CBD5E0"/>
+              <w:right w:val="single" w:sz="6" w:space="0" w:color="CBD5E0"/>
+            </w:tcBorders>
+            <w:tcMar>
+              <w:top w:w="150" w:type="dxa"/>
+              <w:left w:w="150" w:type="dxa"/>
+              <w:bottom w:w="150" w:type="dxa"/>
+              <w:right w:w="150" w:type="dxa"/>
+            </w:tcMar>
+            <w:vAlign w:val="center"/>
+            <w:hideMark/>
+          </w:tcPr>
+          <w:p>
+            <w:pPr>
+              <w:rPr>
+                <w:rFonts w:hint="eastAsia"/>
+              </w:rPr>
+            </w:pPr>
+            <w:r>
+              <w:rPr>
+                <w:rFonts w:ascii="Arial" w:hAnsi="Arial" w:cs="Arial" w:hint="eastAsia"/>
+              </w:rPr>
+              <w:t xml:space="preserve">FHIR </w:t>
+            </w:r>
+            <w:r>
+              <w:rPr>
+                <w:rFonts w:ascii="Arial" w:hAnsi="Arial" w:cs="Arial" w:hint="eastAsia"/>
+              </w:rPr>
+              <w:t>구조를</w:t>
+            </w:r>
+            <w:r>
+              <w:rPr>
+                <w:rFonts w:ascii="Arial" w:hAnsi="Arial" w:cs="Arial" w:hint="eastAsia"/>
+              </w:rPr>
+              <w:t xml:space="preserve"> </w:t>
+            </w:r>
+            <w:r>
+              <w:rPr>
+                <w:rFonts w:ascii="Arial" w:hAnsi="Arial" w:cs="Arial" w:hint="eastAsia"/>
+              </w:rPr>
+              <w:t>참고하여</w:t>
+            </w:r>
+            <w:r>
+              <w:rPr>
+                <w:rFonts w:ascii="Arial" w:hAnsi="Arial" w:cs="Arial" w:hint="eastAsia"/>
+              </w:rPr>
+              <w:t xml:space="preserve"> </w:t>
+            </w:r>
+            <w:r>
+              <w:rPr>
+                <w:rFonts w:ascii="Arial" w:hAnsi="Arial" w:cs="Arial" w:hint="eastAsia"/>
+              </w:rPr>
+              <w:t>자체</w:t>
+            </w:r>
+            <w:r>
+              <w:rPr>
+                <w:rFonts w:ascii="Arial" w:hAnsi="Arial" w:cs="Arial" w:hint="eastAsia"/>
+              </w:rPr>
+              <w:t xml:space="preserve"> </w:t>
+            </w:r>
+            <w:r>
+              <w:rPr>
+                <w:rFonts w:ascii="Arial" w:hAnsi="Arial" w:cs="Arial" w:hint="eastAsia"/>
+              </w:rPr>
+              <w:t>생성</w:t>
+            </w:r>
+          </w:p>
+        </w:tc>
+        <w:tc>
+          <w:tcPr>
+            <w:tcW w:w="3119" w:type="dxa"/>
+            <w:tcBorders>
+              <w:top w:val="single" w:sz="6" w:space="0" w:color="CBD5E0"/>
+              <w:left w:val="single" w:sz="6" w:space="0" w:color="CBD5E0"/>
+              <w:bottom w:val="single" w:sz="6" w:space="0" w:color="CBD5E0"/>
+              <w:right w:val="single" w:sz="6" w:space="0" w:color="CBD5E0"/>
+            </w:tcBorders>
+            <w:tcMar>
+              <w:top w:w="150" w:type="dxa"/>
+              <w:left w:w="150" w:type="dxa"/>
+              <w:bottom w:w="150" w:type="dxa"/>
+              <w:right w:w="150" w:type="dxa"/>
+            </w:tcMar>
+            <w:vAlign w:val="center"/>
+            <w:hideMark/>
+          </w:tcPr>
+          <w:p>
+            <w:pPr>
+              <w:ind w:firstLine="140"/>
+              <w:rPr>
+                <w:rFonts w:hint="eastAsia"/>
+                <w:sz w:val="20"/>
+                <w:szCs w:val="20"/>
+              </w:rPr>
+            </w:pPr>
+            <w:r>
+              <w:rPr>
+                <w:rFonts w:hint="eastAsia"/>
+                <w:sz w:val="20"/>
+                <w:szCs w:val="20"/>
+              </w:rPr>
+              <w:t>환자 상태 분석</w:t>
+            </w:r>
+          </w:p>
+        </w:tc>
+      </w:tr>
+      <w:tr>
+        <w:trPr>
+          <w:trHeight w:val="672"/>
+        </w:trPr>
+        <w:tc>
+          <w:tcPr>
+            <w:tcW w:w="2544" w:type="dxa"/>
+            <w:tcBorders>
+              <w:top w:val="single" w:sz="6" w:space="0" w:color="CBD5E0"/>
+              <w:left w:val="single" w:sz="6" w:space="0" w:color="CBD5E0"/>
+              <w:bottom w:val="single" w:sz="6" w:space="0" w:color="CBD5E0"/>
+              <w:right w:val="single" w:sz="6" w:space="0" w:color="CBD5E0"/>
+            </w:tcBorders>
+            <w:shd w:val="clear" w:color="auto" w:fill="F2F2F2" w:themeFill="background1" w:themeFillShade="F2"/>
+            <w:tcMar>
+              <w:top w:w="150" w:type="dxa"/>
+              <w:left w:w="150" w:type="dxa"/>
+              <w:bottom w:w="150" w:type="dxa"/>
+              <w:right w:w="150" w:type="dxa"/>
+            </w:tcMar>
+            <w:vAlign w:val="center"/>
+            <w:hideMark/>
+          </w:tcPr>
+          <w:p>
+            <w:pPr>
+              <w:rPr>
+                <w:rFonts w:hint="eastAsia"/>
+                <w:b/>
+                <w:bCs/>
+              </w:rPr>
+            </w:pPr>
+            <w:r>
+              <w:rPr>
+                <w:rFonts w:hint="eastAsia"/>
+                <w:b/>
+                <w:bCs/>
+              </w:rPr>
+              <w:t>가상 병동 공간 및 출입 로그</w:t>
+            </w:r>
+          </w:p>
+        </w:tc>
+        <w:tc>
+          <w:tcPr>
+            <w:tcW w:w="3685" w:type="dxa"/>
+            <w:tcBorders>
+              <w:top w:val="single" w:sz="6" w:space="0" w:color="CBD5E0"/>
+              <w:left w:val="single" w:sz="6" w:space="0" w:color="CBD5E0"/>
+              <w:bottom w:val="single" w:sz="6" w:space="0" w:color="CBD5E0"/>
+              <w:right w:val="single" w:sz="6" w:space="0" w:color="CBD5E0"/>
+            </w:tcBorders>
+            <w:tcMar>
+              <w:top w:w="150" w:type="dxa"/>
+              <w:left w:w="150" w:type="dxa"/>
+              <w:bottom w:w="150" w:type="dxa"/>
+              <w:right w:w="150" w:type="dxa"/>
+            </w:tcMar>
+            <w:vAlign w:val="center"/>
+            <w:hideMark/>
+          </w:tcPr>
+          <w:p>
+            <w:pPr>
+              <w:rPr>
+                <w:rFonts w:hint="eastAsia"/>
+              </w:rPr>
+            </w:pPr>
+            <w:r>
+              <w:rPr>
+                <w:rFonts w:ascii="Arial" w:hAnsi="Arial" w:cs="Arial"/>
+              </w:rPr>
+              <w:t>가상의</w:t>
+            </w:r>
+            <w:r>
+              <w:rPr>
+                <w:rFonts w:ascii="Arial" w:hAnsi="Arial" w:cs="Arial"/>
+              </w:rPr>
+              <w:t xml:space="preserve"> </w:t>
+            </w:r>
+            <w:r>
+              <w:rPr>
+                <w:rFonts w:ascii="Arial" w:hAnsi="Arial" w:cs="Arial"/>
+              </w:rPr>
+              <w:t>병동</w:t>
+            </w:r>
+            <w:r>
+              <w:rPr>
+                <w:rFonts w:ascii="Arial" w:hAnsi="Arial" w:cs="Arial"/>
+              </w:rPr>
+              <w:t xml:space="preserve"> </w:t>
+            </w:r>
+            <w:r>
+              <w:rPr>
+                <w:rFonts w:ascii="Arial" w:hAnsi="Arial" w:cs="Arial"/>
+              </w:rPr>
+              <w:t>공간</w:t>
+            </w:r>
+            <w:r>
+              <w:rPr>
+                <w:rFonts w:ascii="Arial" w:hAnsi="Arial" w:cs="Arial"/>
+              </w:rPr>
+              <w:t xml:space="preserve">(POI) </w:t>
+            </w:r>
+            <w:r>
+              <w:rPr>
+                <w:rFonts w:ascii="Arial" w:hAnsi="Arial" w:cs="Arial"/>
+              </w:rPr>
+              <w:t>데이터를</w:t>
+            </w:r>
+            <w:r>
+              <w:rPr>
+                <w:rFonts w:ascii="Arial" w:hAnsi="Arial" w:cs="Arial"/>
+              </w:rPr>
+              <w:t xml:space="preserve"> </w:t>
+            </w:r>
+            <w:r>
+              <w:rPr>
+                <w:rFonts w:ascii="Arial" w:hAnsi="Arial" w:cs="Arial"/>
+              </w:rPr>
+              <w:t>설계하고</w:t>
+            </w:r>
+            <w:r>
+              <w:rPr>
+                <w:rFonts w:ascii="Arial" w:hAnsi="Arial" w:cs="Arial"/>
+              </w:rPr>
+              <w:t xml:space="preserve">, Python </w:t>
+            </w:r>
+            <w:r>
+              <w:rPr>
+                <w:rFonts w:ascii="Arial" w:hAnsi="Arial" w:cs="Arial"/>
+              </w:rPr>
+              <w:t>기반</w:t>
+            </w:r>
+            <w:r>
+              <w:rPr>
+                <w:rFonts w:ascii="Arial" w:hAnsi="Arial" w:cs="Arial"/>
+              </w:rPr>
+              <w:t xml:space="preserve"> </w:t>
+            </w:r>
+            <w:r>
+              <w:rPr>
+                <w:rFonts w:ascii="Arial" w:hAnsi="Arial" w:cs="Arial"/>
+              </w:rPr>
+              <w:t>가상</w:t>
+            </w:r>
+            <w:r>
+              <w:rPr>
+                <w:rFonts w:ascii="Arial" w:hAnsi="Arial" w:cs="Arial"/>
+              </w:rPr>
+              <w:t xml:space="preserve"> </w:t>
+            </w:r>
+            <w:r>
+              <w:rPr>
+                <w:rFonts w:ascii="Arial" w:hAnsi="Arial" w:cs="Arial"/>
+              </w:rPr>
+              <w:t>데이터</w:t>
+            </w:r>
+            <w:r>
+              <w:rPr>
+                <w:rFonts w:ascii="Arial" w:hAnsi="Arial" w:cs="Arial"/>
+              </w:rPr>
+              <w:t xml:space="preserve"> </w:t>
+            </w:r>
+            <w:r>
+              <w:rPr>
+                <w:rFonts w:ascii="Arial" w:hAnsi="Arial" w:cs="Arial"/>
+              </w:rPr>
+              <w:t>생성으로</w:t>
+            </w:r>
+            <w:r>
+              <w:rPr>
+                <w:rFonts w:ascii="Arial" w:hAnsi="Arial" w:cs="Arial"/>
+              </w:rPr>
+              <w:t xml:space="preserve"> </w:t>
+            </w:r>
+            <w:r>
+              <w:rPr>
+                <w:rFonts w:ascii="Arial" w:hAnsi="Arial" w:cs="Arial"/>
+              </w:rPr>
+              <w:t>시계열</w:t>
+            </w:r>
+            <w:r>
+              <w:rPr>
+                <w:rFonts w:ascii="Arial" w:hAnsi="Arial" w:cs="Arial"/>
+              </w:rPr>
+              <w:t xml:space="preserve"> </w:t>
+            </w:r>
+            <w:r>
+              <w:rPr>
+                <w:rFonts w:ascii="Arial" w:hAnsi="Arial" w:cs="Arial"/>
+              </w:rPr>
+              <w:t>출입</w:t>
+            </w:r>
+            <w:r>
+              <w:rPr>
+                <w:rFonts w:ascii="Arial" w:hAnsi="Arial" w:cs="Arial"/>
+              </w:rPr>
+              <w:t xml:space="preserve"> </w:t>
+            </w:r>
+            <w:r>
+              <w:rPr>
+                <w:rFonts w:ascii="Arial" w:hAnsi="Arial" w:cs="Arial"/>
+              </w:rPr>
+              <w:t>로그를</w:t>
+            </w:r>
+            <w:r>
+              <w:rPr>
+                <w:rFonts w:ascii="Arial" w:hAnsi="Arial" w:cs="Arial"/>
+              </w:rPr>
+              <w:t xml:space="preserve"> </w:t>
+            </w:r>
+            <w:r>
+              <w:rPr>
+                <w:rFonts w:ascii="Arial" w:hAnsi="Arial" w:cs="Arial"/>
+              </w:rPr>
+              <w:t>생성</w:t>
+            </w:r>
+          </w:p>
+        </w:tc>
+        <w:tc>
+          <w:tcPr>
+            <w:tcW w:w="3119" w:type="dxa"/>
+            <w:tcBorders>
+              <w:top w:val="single" w:sz="6" w:space="0" w:color="CBD5E0"/>
+              <w:left w:val="single" w:sz="6" w:space="0" w:color="CBD5E0"/>
+              <w:bottom w:val="single" w:sz="6" w:space="0" w:color="CBD5E0"/>
+              <w:right w:val="single" w:sz="6" w:space="0" w:color="CBD5E0"/>
+            </w:tcBorders>
+            <w:tcMar>
+              <w:top w:w="150" w:type="dxa"/>
+              <w:left w:w="150" w:type="dxa"/>
+              <w:bottom w:w="150" w:type="dxa"/>
+              <w:right w:w="150" w:type="dxa"/>
+            </w:tcMar>
+            <w:vAlign w:val="center"/>
+            <w:hideMark/>
+          </w:tcPr>
+          <w:p>
+            <w:pPr>
+              <w:rPr>
+                <w:color w:val="1F3A3D"/>
+                <w:sz w:val="20"/>
+                <w:szCs w:val="20"/>
+              </w:rPr>
+            </w:pPr>
+            <w:proofErr w:type="spellStart"/>
+            <w:r>
+              <w:rPr>
+                <w:rFonts w:ascii="Arial" w:hAnsi="Arial" w:cs="Arial" w:hint="eastAsia"/>
+              </w:rPr>
+              <w:t>접촉자</w:t>
+            </w:r>
+            <w:proofErr w:type="spellEnd"/>
+            <w:r>
+              <w:rPr>
+                <w:rFonts w:ascii="Arial" w:hAnsi="Arial" w:cs="Arial" w:hint="eastAsia"/>
+              </w:rPr>
+              <w:t xml:space="preserve"> </w:t>
+            </w:r>
+            <w:r>
+              <w:rPr>
+                <w:rFonts w:ascii="Arial" w:hAnsi="Arial" w:cs="Arial" w:hint="eastAsia"/>
+              </w:rPr>
+              <w:t>분석</w:t>
+            </w:r>
+            <w:r>
+              <w:rPr>
+                <w:rFonts w:ascii="Arial" w:hAnsi="Arial" w:cs="Arial" w:hint="eastAsia"/>
+              </w:rPr>
+              <w:t xml:space="preserve"> </w:t>
+            </w:r>
+            <w:r>
+              <w:rPr>
+                <w:rFonts w:ascii="Arial" w:hAnsi="Arial" w:cs="Arial" w:hint="eastAsia"/>
+              </w:rPr>
+              <w:t>및</w:t>
+            </w:r>
+            <w:r>
+              <w:rPr>
+                <w:rFonts w:ascii="Arial" w:hAnsi="Arial" w:cs="Arial" w:hint="eastAsia"/>
+              </w:rPr>
+              <w:t xml:space="preserve"> </w:t>
+            </w:r>
+            <w:r>
+              <w:rPr>
+                <w:rFonts w:ascii="Arial" w:hAnsi="Arial" w:cs="Arial" w:hint="eastAsia"/>
+              </w:rPr>
+              <w:t>공간</w:t>
+            </w:r>
+            <w:r>
+              <w:rPr>
+                <w:rFonts w:ascii="Arial" w:hAnsi="Arial" w:cs="Arial" w:hint="eastAsia"/>
+              </w:rPr>
+              <w:t xml:space="preserve"> </w:t>
+            </w:r>
+            <w:r>
+              <w:rPr>
+                <w:rFonts w:ascii="Arial" w:hAnsi="Arial" w:cs="Arial" w:hint="eastAsia"/>
+              </w:rPr>
+              <w:t>추론</w:t>
+            </w:r>
+          </w:p>
+        </w:tc>
+      </w:tr>
+    </w:tbl>
+    <w:p>
+      <w:pPr>
+        <w:pStyle w:val="1"/>
+        <w:spacing w:before="360" w:after="60"/>
+        <w:rPr>
+          <w:rFonts w:hint="eastAsia"/>
+          <w:color w:val="auto"/>
+          <w:sz w:val="21"/>
+          <w:szCs w:val="21"/>
+        </w:rPr>
+      </w:pPr>
+      <w:r>
+        <w:rPr>
+          <w:color w:val="auto"/>
+          <w:sz w:val="21"/>
+          <w:szCs w:val="21"/>
+        </w:rPr>
+        <w:t xml:space="preserve">본 프로젝트는 공개 감염관리 지침과 가상의 임상·공간 데이터를 결합한 융합 데이터셋을 구축하여, 실제 병원 환경에서의 감염관리 의사결정 과정을 모사하는 것을 목표로 </w:t>
+      </w:r>
+      <w:r>
+        <w:rPr>
+          <w:rFonts w:hint="eastAsia"/>
+          <w:color w:val="auto"/>
+          <w:sz w:val="21"/>
+          <w:szCs w:val="21"/>
+        </w:rPr>
+        <w:t>합니다</w:t>
+      </w:r>
+      <w:r>
+        <w:rPr>
+          <w:color w:val="auto"/>
+          <w:sz w:val="21"/>
+          <w:szCs w:val="21"/>
+        </w:rPr>
+        <w:t>.</w:t>
+      </w:r>
+    </w:p>
+    <w:p>
+      <w:pPr>
+        <w:pStyle w:val="1"/>
+        <w:spacing w:before="360" w:after="60"/>
+      </w:pPr>
+      <w:r>
+        <w:rPr>
+          <w:b/>
+          <w:bCs/>
+          <w:color w:val="028090"/>
+          <w:sz w:val="26"/>
+          <w:szCs w:val="26"/>
+        </w:rPr>
+        <w:t xml:space="preserve">6. </w:t>
+      </w:r>
+      <w:proofErr w:type="spellStart"/>
+      <w:r>
+        <w:rPr>
+          <w:b/>
+          <w:bCs/>
+          <w:color w:val="028090"/>
+          <w:sz w:val="26"/>
+          <w:szCs w:val="26"/>
+        </w:rPr>
+        <w:t>sLLM</w:t>
+      </w:r>
+      <w:proofErr w:type="spellEnd"/>
+      <w:r>
+        <w:rPr>
+          <w:b/>
+          <w:bCs/>
+          <w:color w:val="028090"/>
+          <w:sz w:val="26"/>
+          <w:szCs w:val="26"/>
+        </w:rPr>
+        <w:t xml:space="preserve"> 활용 방법</w:t>
+      </w:r>
+    </w:p>
+    <w:p>
+      <w:pPr>
+        <w:spacing w:before="40" w:after="120"/>
+      </w:pPr>
+      <w:r>
+        <w:rPr>
+          <w:i/>
+          <w:iCs/>
+          <w:color w:val="808080"/>
+          <w:sz w:val="19"/>
+          <w:szCs w:val="19"/>
+        </w:rPr>
+        <w:t xml:space="preserve">질의응답, 문서 요약, 정보 검색, 분류, 보고서 작성 등 </w:t>
+      </w:r>
+      <w:proofErr w:type="spellStart"/>
+      <w:r>
+        <w:rPr>
+          <w:i/>
+          <w:iCs/>
+          <w:color w:val="808080"/>
+          <w:sz w:val="19"/>
+          <w:szCs w:val="19"/>
+        </w:rPr>
+        <w:t>sLLM</w:t>
+      </w:r>
+      <w:proofErr w:type="spellEnd"/>
+      <w:r>
+        <w:rPr>
+          <w:i/>
+          <w:iCs/>
+          <w:color w:val="808080"/>
+          <w:sz w:val="19"/>
+          <w:szCs w:val="19"/>
+        </w:rPr>
+        <w:t>을 어떻게 활용할지 작성해 주세요.</w:t>
       </w:r>
     </w:p>
     <w:tbl>
@@ -3317,12 +5115,6 @@
         <w:gridCol w:w="9360"/>
       </w:tblGrid>
       <w:tr>
-        <w:tblPrEx>
-          <w:tblCellMar>
-            <w:top w:w="0" w:type="dxa"/>
-            <w:bottom w:w="0" w:type="dxa"/>
-          </w:tblCellMar>
-        </w:tblPrEx>
         <w:tc>
           <w:tcPr>
             <w:tcW w:w="9360" w:type="dxa"/>
@@ -3341,62 +5133,257 @@
           </w:tcPr>
           <w:p>
             <w:r>
-              <w:t xml:space="preserve">본 프로젝트는 1개월이라는 타이트한 개발 기간과 의료 데이터 보안 이슈를 고려하여, 실제 병원 망 연동 대신 백엔드 및 데이터베이스 설계 원칙에 맞추어 </w:t>
-            </w:r>
-            <w:r>
-              <w:rPr>
-                <w:b/>
-                <w:bCs/>
-              </w:rPr>
-              <w:t>정제된 가상 데이터셋(Synthetic Data)</w:t>
-            </w:r>
-            <w:r>
-              <w:t xml:space="preserve"> 을 직접 구축하여 활용합니다</w:t>
-            </w:r>
-            <w:r>
+              <w:t xml:space="preserve">기존 규칙(Rule) 기반 시스템은 동일 병실, 동일 시간대와 같은 정형 조건 비교에 주로 의존합니다. 본 프로젝트에서는 의료진의 서술형 EMR 기록과 감염관리 지침을 함께 이해하고 종합적인 판단을 수행하기 위해 </w:t>
+            </w:r>
+            <w:proofErr w:type="spellStart"/>
+            <w:r>
+              <w:rPr>
+                <w:b/>
+                <w:bCs/>
+              </w:rPr>
+              <w:t>sLLM</w:t>
+            </w:r>
+            <w:proofErr w:type="spellEnd"/>
+            <w:r>
+              <w:rPr>
+                <w:b/>
+                <w:bCs/>
+              </w:rPr>
+              <w:t xml:space="preserve">을 </w:t>
+            </w:r>
+            <w:proofErr w:type="spellStart"/>
+            <w:r>
+              <w:rPr>
+                <w:b/>
+                <w:bCs/>
+              </w:rPr>
+              <w:t>LangGraph</w:t>
+            </w:r>
+            <w:proofErr w:type="spellEnd"/>
+            <w:r>
+              <w:rPr>
+                <w:b/>
+                <w:bCs/>
+              </w:rPr>
+              <w:t xml:space="preserve"> 기반 AI Agent의 핵심 추론 엔진(Reasoning Engine</w:t>
+            </w:r>
+            <w:proofErr w:type="gramStart"/>
+            <w:r>
+              <w:rPr>
+                <w:b/>
+                <w:bCs/>
+              </w:rPr>
+              <w:t>)</w:t>
+            </w:r>
+            <w:r>
+              <w:t xml:space="preserve"> 으로</w:t>
+            </w:r>
+            <w:proofErr w:type="gramEnd"/>
+            <w:r>
+              <w:t xml:space="preserve"> 활용합니다.</w:t>
+            </w:r>
+          </w:p>
+          <w:p/>
+          <w:p>
+            <w:pPr>
               <w:rPr>
                 <w:rFonts w:hint="eastAsia"/>
-              </w:rPr>
-              <w:t>.</w:t>
-            </w:r>
-          </w:p>
-          <w:p>
-            <w:pPr>
-              <w:numPr>
-                <w:ilvl w:val="0"/>
-                <w:numId w:val="3"/>
-              </w:numPr>
-            </w:pPr>
-            <w:r>
-              <w:rPr>
-                <w:b/>
-                <w:bCs/>
-              </w:rPr>
-              <w:t>입력 데이터(가상 생성):</w:t>
-            </w:r>
-            <w:r>
-              <w:t xml:space="preserve"> EMR, 간호/의사 기록, 병실 출입 및 이동 기록, 검사 결과를 관계형 스키마에 맞게 JSON/CSV 형태로 자체 제작</w:t>
-            </w:r>
-          </w:p>
-          <w:p>
-            <w:pPr>
-              <w:numPr>
-                <w:ilvl w:val="0"/>
-                <w:numId w:val="3"/>
-              </w:numPr>
+                <w:b/>
+                <w:bCs/>
+              </w:rPr>
+            </w:pPr>
+            <w:r>
               <w:rPr>
                 <w:rFonts w:hint="eastAsia"/>
-              </w:rPr>
-            </w:pPr>
-            <w:r>
-              <w:rPr>
-                <w:b/>
-                <w:bCs/>
-              </w:rPr>
-              <w:t>RAG 지식베이스 구축용 데이터:</w:t>
-            </w:r>
-            <w:r>
-              <w:t xml:space="preserve"> 실제 공개된 질병관리청 감염관리 지침(RAG 적용을 위한 PDF), 자체 작성한 가상의 병원 내부 감염관리 SOP 문서</w:t>
+                <w:b/>
+                <w:bCs/>
+              </w:rPr>
+              <w:t>[활용 방법</w:t>
+            </w:r>
+            <w:r>
+              <w:rPr>
+                <w:rFonts w:hint="eastAsia"/>
+                <w:b/>
+                <w:bCs/>
+              </w:rPr>
+              <w:t>]</w:t>
+            </w:r>
+          </w:p>
+          <w:p>
+            <w:pPr>
+              <w:rPr>
+                <w:b/>
+                <w:bCs/>
+              </w:rPr>
+            </w:pPr>
+            <w:r>
+              <w:rPr>
+                <w:b/>
+                <w:bCs/>
+              </w:rPr>
+              <w:t>① Tool Calling 기반 데이터 조회</w:t>
+            </w:r>
+          </w:p>
+          <w:p>
+            <w:r>
+              <w:t xml:space="preserve">사용자의 질의를 분석한 후 </w:t>
+            </w:r>
+            <w:proofErr w:type="spellStart"/>
+            <w:r>
+              <w:t>LangGraph</w:t>
+            </w:r>
+            <w:proofErr w:type="spellEnd"/>
+            <w:r>
+              <w:t xml:space="preserve"> 워크플로우에서 필요한 도구를 선택하여 </w:t>
+            </w:r>
+            <w:r>
+              <w:rPr>
+                <w:b/>
+                <w:bCs/>
+              </w:rPr>
+              <w:t>공간 정보 및 출입 로그 조회 Tool</w:t>
+            </w:r>
+            <w:r>
+              <w:t xml:space="preserve">, </w:t>
+            </w:r>
+            <w:r>
+              <w:rPr>
+                <w:b/>
+                <w:bCs/>
+              </w:rPr>
+              <w:t>감염관리 지침 검색(RAG) Tool</w:t>
+            </w:r>
+            <w:r>
+              <w:t xml:space="preserve"> 등을 호출하고, 필요한 데이터를 수집합니다.</w:t>
+            </w:r>
+          </w:p>
+          <w:p>
+            <w:pPr>
+              <w:rPr>
+                <w:rFonts w:hint="eastAsia"/>
+              </w:rPr>
+            </w:pPr>
+          </w:p>
+          <w:p>
+            <w:pPr>
+              <w:rPr>
+                <w:b/>
+                <w:bCs/>
+              </w:rPr>
+            </w:pPr>
+            <w:r>
+              <w:rPr>
+                <w:b/>
+                <w:bCs/>
+              </w:rPr>
+              <w:lastRenderedPageBreak/>
+              <w:t>② 비정형 의료기록의 맥락 이해</w:t>
+            </w:r>
+          </w:p>
+          <w:p>
+            <w:r>
+              <w:t>EMR, 간호기록, 의사기록 등 비정형 의료 문서를 분석하여 증상 발생 시점, 보호구 착용 여부, 감염 의심 상황 등 감염관리 판단에 필요한 정보를 추출합니다.</w:t>
+            </w:r>
+          </w:p>
+          <w:p>
+            <w:pPr>
+              <w:rPr>
+                <w:rFonts w:hint="eastAsia"/>
+              </w:rPr>
+            </w:pPr>
+          </w:p>
+          <w:p>
+            <w:pPr>
+              <w:rPr>
+                <w:b/>
+                <w:bCs/>
+              </w:rPr>
+            </w:pPr>
+            <w:r>
+              <w:rPr>
+                <w:b/>
+                <w:bCs/>
+              </w:rPr>
+              <w:t>③ 다중 데이터 기반 조사 의견서 초안 생성</w:t>
+            </w:r>
+          </w:p>
+          <w:p>
+            <w:r>
+              <w:t xml:space="preserve">공간 데이터, 출입 로그, 비정형 의료기록, 감염관리 SOP를 종합적으로 분석하여 </w:t>
+            </w:r>
+            <w:proofErr w:type="spellStart"/>
+            <w:r>
+              <w:t>접촉자</w:t>
+            </w:r>
+            <w:proofErr w:type="spellEnd"/>
+            <w:r>
+              <w:t xml:space="preserve"> 위험도와 권장 조치가 포함된 </w:t>
+            </w:r>
+            <w:r>
+              <w:rPr>
+                <w:b/>
+                <w:bCs/>
+              </w:rPr>
+              <w:t>조사 의견서 초안</w:t>
+            </w:r>
+            <w:r>
+              <w:t>을 생성하고, 담당자가 검토·수정 후 최종 승인할 수 있도록 지원합니다.</w:t>
+            </w:r>
+          </w:p>
+          <w:p/>
+          <w:p>
+            <w:pPr>
+              <w:rPr>
+                <w:b/>
+                <w:bCs/>
+              </w:rPr>
+            </w:pPr>
+            <w:r>
+              <w:rPr>
+                <w:b/>
+                <w:bCs/>
+              </w:rPr>
+              <w:t>④ 로컬 환경 기반 의료 데이터 보호</w:t>
+            </w:r>
+          </w:p>
+          <w:p>
+            <w:pPr>
+              <w:rPr>
+                <w:rFonts w:hint="eastAsia"/>
+              </w:rPr>
+            </w:pPr>
+            <w:r>
+              <w:t xml:space="preserve">민감한 의료정보 보호를 위해 </w:t>
+            </w:r>
+            <w:proofErr w:type="spellStart"/>
+            <w:r>
+              <w:t>sLLM</w:t>
+            </w:r>
+            <w:proofErr w:type="spellEnd"/>
+            <w:r>
+              <w:t xml:space="preserve">을 </w:t>
+            </w:r>
+            <w:r>
+              <w:rPr>
+                <w:b/>
+                <w:bCs/>
+              </w:rPr>
+              <w:t>로컬 환경(Local Deployment</w:t>
+            </w:r>
+            <w:proofErr w:type="gramStart"/>
+            <w:r>
+              <w:rPr>
+                <w:b/>
+                <w:bCs/>
+              </w:rPr>
+              <w:t>)</w:t>
+            </w:r>
+            <w:r>
+              <w:t xml:space="preserve"> 에서</w:t>
+            </w:r>
+            <w:proofErr w:type="gramEnd"/>
+            <w:r>
+              <w:t xml:space="preserve"> 구동하는 구조를 적용하며, Guardrail을 통해 개인정보 노출을 최소화하는 방안을 적용합니다.</w:t>
             </w:r>
           </w:p>
         </w:tc>
@@ -3415,7 +5402,8 @@
           <w:sz w:val="26"/>
           <w:szCs w:val="26"/>
         </w:rPr>
-        <w:t>6. sLLM 활용 방법</w:t>
+        <w:lastRenderedPageBreak/>
+        <w:t>7. 최종 결과물</w:t>
       </w:r>
     </w:p>
     <w:p>
@@ -3430,7 +5418,29 @@
           <w:sz w:val="19"/>
           <w:szCs w:val="19"/>
         </w:rPr>
-        <w:t>질의응답, 문서 요약, 정보 검색, 분류, 보고서 작성 등 sLLM을 어떻게 활용할지 작성해 주세요.</w:t>
+        <w:t xml:space="preserve">웹 서비스, </w:t>
+      </w:r>
+      <w:proofErr w:type="spellStart"/>
+      <w:r>
+        <w:rPr>
+          <w:i/>
+          <w:iCs/>
+          <w:color w:val="808080"/>
+          <w:sz w:val="19"/>
+          <w:szCs w:val="19"/>
+        </w:rPr>
+        <w:t>챗봇</w:t>
+      </w:r>
+      <w:proofErr w:type="spellEnd"/>
+      <w:r>
+        <w:rPr>
+          <w:i/>
+          <w:iCs/>
+          <w:color w:val="808080"/>
+          <w:sz w:val="19"/>
+          <w:szCs w:val="19"/>
+        </w:rPr>
+        <w:t>, 문서 분석 도구, 연구 지원 도구 등 한 달 후 예상되는 결과물의 형태를 작성해 주세요.</w:t>
       </w:r>
     </w:p>
     <w:tbl>
@@ -3454,12 +5464,6 @@
         <w:gridCol w:w="9360"/>
       </w:tblGrid>
       <w:tr>
-        <w:tblPrEx>
-          <w:tblCellMar>
-            <w:top w:w="0" w:type="dxa"/>
-            <w:bottom w:w="0" w:type="dxa"/>
-          </w:tblCellMar>
-        </w:tblPrEx>
         <w:tc>
           <w:tcPr>
             <w:tcW w:w="9360" w:type="dxa"/>
@@ -3477,133 +5481,128 @@
             </w:tcMar>
           </w:tcPr>
           <w:p>
-            <w:r>
-              <w:t>단순 Rule 기반 시스템은 '동일 병실, 동일 시간대' 등의 정형화된 조건 매칭에 국한됩니다. 그러나 감염관리 역학조사는 의료진의 서술형 기록에 포함된 맥락(예: 비말 노출 여부, 처치 시 방호복 착용 상태 등)을 정확히 이해해야 합니다.</w:t>
+            <w:pPr>
+              <w:rPr>
+                <w:b/>
+                <w:bCs/>
+              </w:rPr>
+            </w:pPr>
+            <w:r>
+              <w:rPr>
+                <w:b/>
+                <w:bCs/>
+              </w:rPr>
+              <w:t>AI Agent 기반 감염관리 조사 지원 웹 대시보드 (프로토타입)</w:t>
             </w:r>
           </w:p>
           <w:p>
             <w:pPr>
               <w:rPr>
                 <w:rFonts w:hint="eastAsia"/>
-              </w:rPr>
-            </w:pPr>
-            <w:r>
-              <w:t xml:space="preserve">따라서 sLLM을 활용하여 비정형 텍스트 기록들을 심층적으로 분석하고, RAG(검색 증강 생성) 기법을 통해 사전에 임베딩된 내부 지침(SOP)을 검색하여 </w:t>
-            </w:r>
-            <w:r>
-              <w:rPr>
-                <w:b/>
-                <w:bCs/>
-              </w:rPr>
-              <w:t>조사 의견서 작성 및 정보 종합(Summarization &amp; Generation)</w:t>
-            </w:r>
-            <w:r>
-              <w:t xml:space="preserve"> 에 활용합니다. 또한, 의료 데이터의 특성상 병원의 민감 정보 유출을 방지하기 위해 외부 클라우드 의존도를 낮추고 로컬 환경(On-premise)에서 운용 가능한 sLLM 아키텍처의 실효성을 검증합니다</w:t>
-            </w:r>
-            <w:r>
+                <w:b/>
+                <w:bCs/>
+              </w:rPr>
+            </w:pPr>
+          </w:p>
+          <w:p>
+            <w:pPr>
               <w:rPr>
                 <w:rFonts w:hint="eastAsia"/>
               </w:rPr>
+            </w:pPr>
+            <w:r>
+              <w:t xml:space="preserve">1개월 내 구현 가능한 범위를 고려하여 실제 병원 시스템 연동 대신 </w:t>
+            </w:r>
+            <w:r>
+              <w:rPr>
+                <w:b/>
+                <w:bCs/>
+              </w:rPr>
+              <w:t>가상 의료 데이터와 병동 공간 데이터를 활용한 독립형 웹 기반 프로토타입</w:t>
+            </w:r>
+            <w:r>
+              <w:t>을 개발합니다.</w:t>
+            </w:r>
+          </w:p>
+          <w:p>
+            <w:pPr>
+              <w:rPr>
+                <w:rFonts w:hint="eastAsia"/>
+              </w:rPr>
+            </w:pPr>
+            <w:r>
+              <w:t xml:space="preserve">감염관리 담당자가 환자 ID를 입력하면 </w:t>
+            </w:r>
+            <w:proofErr w:type="spellStart"/>
+            <w:r>
+              <w:t>LangGraph</w:t>
+            </w:r>
+            <w:proofErr w:type="spellEnd"/>
+            <w:r>
+              <w:t xml:space="preserve"> 기반 AI Agent가 EMR, 병동 공간(POI) 및 출입 로그(PostgreSQL), 감염관리 SOP(Vector DB)를 통합적으로 조회·분석하여 다음과 같은 결과를 제공합니다.</w:t>
+            </w:r>
+          </w:p>
+          <w:p>
+            <w:pPr>
+              <w:numPr>
+                <w:ilvl w:val="0"/>
+                <w:numId w:val="5"/>
+              </w:numPr>
+            </w:pPr>
+            <w:r>
+              <w:t xml:space="preserve">환자 기본 정보 및 감염 관련 기록 </w:t>
+            </w:r>
+          </w:p>
+          <w:p>
+            <w:pPr>
+              <w:numPr>
+                <w:ilvl w:val="0"/>
+                <w:numId w:val="5"/>
+              </w:numPr>
+            </w:pPr>
+            <w:r>
+              <w:t xml:space="preserve">접촉 가능 대상자 및 위험도 분석 결과 </w:t>
+            </w:r>
+          </w:p>
+          <w:p>
+            <w:pPr>
+              <w:numPr>
+                <w:ilvl w:val="0"/>
+                <w:numId w:val="5"/>
+              </w:numPr>
+            </w:pPr>
+            <w:r>
+              <w:t xml:space="preserve">적용된 감염관리 SOP 및 판단 근거 </w:t>
+            </w:r>
+          </w:p>
+          <w:p>
+            <w:pPr>
+              <w:numPr>
+                <w:ilvl w:val="0"/>
+                <w:numId w:val="5"/>
+              </w:numPr>
+            </w:pPr>
+            <w:r>
+              <w:t xml:space="preserve">AI가 생성한 감염 조사 의견서 초안 </w:t>
+            </w:r>
+          </w:p>
+          <w:p>
+            <w:pPr>
+              <w:rPr>
+                <w:rFonts w:hint="eastAsia"/>
+                <w:b/>
+                <w:bCs/>
+              </w:rPr>
+            </w:pPr>
+            <w:r>
+              <w:t>담당자는 웹 대시보드에서 AI가 생성한 결과를 검토·수정한 후 최종 승인할 수 있으며, 승인된 결과는 구조화된 JSON 형태로 저장되어 향후 병원 시스템과의 연계를 고려한 프로토타입을 구현합니다</w:t>
+            </w:r>
+            <w:r>
+              <w:rPr>
+                <w:b/>
+                <w:bCs/>
+              </w:rPr>
               <w:t>.</w:t>
-            </w:r>
-          </w:p>
-        </w:tc>
-      </w:tr>
-    </w:tbl>
-    <w:p>
-      <w:pPr>
-        <w:pStyle w:val="1"/>
-        <w:spacing w:before="360" w:after="60"/>
-      </w:pPr>
-      <w:r>
-        <w:rPr>
-          <w:b/>
-          <w:bCs/>
-          <w:color w:val="028090"/>
-          <w:sz w:val="26"/>
-          <w:szCs w:val="26"/>
-        </w:rPr>
-        <w:t>7. 최종 결과물</w:t>
-      </w:r>
-    </w:p>
-    <w:p>
-      <w:pPr>
-        <w:spacing w:before="40" w:after="120"/>
-      </w:pPr>
-      <w:r>
-        <w:rPr>
-          <w:i/>
-          <w:iCs/>
-          <w:color w:val="808080"/>
-          <w:sz w:val="19"/>
-          <w:szCs w:val="19"/>
-        </w:rPr>
-        <w:t>웹 서비스, 챗봇, 문서 분석 도구, 연구 지원 도구 등 한 달 후 예상되는 결과물의 형태를 작성해 주세요.</w:t>
-      </w:r>
-    </w:p>
-    <w:tbl>
-      <w:tblPr>
-        <w:tblW w:w="9360" w:type="dxa"/>
-        <w:tblBorders>
-          <w:top w:val="single" w:sz="4" w:space="0" w:color="auto"/>
-          <w:left w:val="single" w:sz="4" w:space="0" w:color="auto"/>
-          <w:bottom w:val="single" w:sz="4" w:space="0" w:color="auto"/>
-          <w:right w:val="single" w:sz="4" w:space="0" w:color="auto"/>
-          <w:insideH w:val="single" w:sz="4" w:space="0" w:color="auto"/>
-          <w:insideV w:val="single" w:sz="4" w:space="0" w:color="auto"/>
-        </w:tblBorders>
-        <w:tblCellMar>
-          <w:left w:w="10" w:type="dxa"/>
-          <w:right w:w="10" w:type="dxa"/>
-        </w:tblCellMar>
-        <w:tblLook w:val="0000" w:firstRow="0" w:lastRow="0" w:firstColumn="0" w:lastColumn="0" w:noHBand="0" w:noVBand="0"/>
-      </w:tblPr>
-      <w:tblGrid>
-        <w:gridCol w:w="9360"/>
-      </w:tblGrid>
-      <w:tr>
-        <w:tblPrEx>
-          <w:tblCellMar>
-            <w:top w:w="0" w:type="dxa"/>
-            <w:bottom w:w="0" w:type="dxa"/>
-          </w:tblCellMar>
-        </w:tblPrEx>
-        <w:tc>
-          <w:tcPr>
-            <w:tcW w:w="9360" w:type="dxa"/>
-            <w:tcBorders>
-              <w:top w:val="single" w:sz="4" w:space="0" w:color="BBD6D8"/>
-              <w:left w:val="single" w:sz="4" w:space="0" w:color="BBD6D8"/>
-              <w:bottom w:val="single" w:sz="4" w:space="0" w:color="BBD6D8"/>
-              <w:right w:val="single" w:sz="4" w:space="0" w:color="BBD6D8"/>
-            </w:tcBorders>
-            <w:tcMar>
-              <w:top w:w="120" w:type="dxa"/>
-              <w:left w:w="160" w:type="dxa"/>
-              <w:bottom w:w="120" w:type="dxa"/>
-              <w:right w:w="160" w:type="dxa"/>
-            </w:tcMar>
-          </w:tcPr>
-          <w:p>
-            <w:r>
-              <w:rPr>
-                <w:b/>
-                <w:bCs/>
-              </w:rPr>
-              <w:t>AI 감염관리 조사 지원 웹 대시보드 (프로토타입 시스템)</w:t>
-            </w:r>
-            <w:r>
-              <w:t xml:space="preserve"> </w:t>
-            </w:r>
-          </w:p>
-          <w:p>
-            <w:pPr>
-              <w:rPr>
-                <w:rFonts w:hint="eastAsia"/>
-              </w:rPr>
-            </w:pPr>
-            <w:r>
-              <w:t>1개월 내 현실적인 구현을 위해 복잡한 병원 망 연동을 배제하고, 가상 데이터를 업로드하여 결과를 시뮬레이션하는 독립된 웹 서비스 형태로 개발합니다. 사용자가 발생 환자의 ID를 조회하면, 백엔드에서 sLLM과 Vector DB가 연동되어 노출자 명단, 적용 지침, 위험도, 조사 의견서 초안을 화면에 출력합니다. 담당자가 이를 확인하고 최종 승인 프로세스를 진행하는 UI를 구현하여 실제 임상 워크플로우를 그대로 재현합니다.</w:t>
             </w:r>
           </w:p>
         </w:tc>
@@ -3680,7 +5679,7 @@
         <w:sz w:val="20"/>
       </w:rPr>
     </w:lvl>
-    <w:lvl w:ilvl="1" w:tentative="1">
+    <w:lvl w:ilvl="1">
       <w:start w:val="1"/>
       <w:numFmt w:val="bullet"/>
       <w:lvlText w:val="o"/>
@@ -4044,6 +6043,304 @@
       </w:rPr>
     </w:lvl>
   </w:abstractNum>
+  <w:abstractNum w:abstractNumId="3" w15:restartNumberingAfterBreak="0">
+    <w:nsid w:val="517117F9"/>
+    <w:multiLevelType w:val="multilevel"/>
+    <w:tmpl w:val="BD04BE2A"/>
+    <w:lvl w:ilvl="0">
+      <w:start w:val="1"/>
+      <w:numFmt w:val="bullet"/>
+      <w:lvlText w:val=""/>
+      <w:lvlJc w:val="left"/>
+      <w:pPr>
+        <w:tabs>
+          <w:tab w:val="num" w:pos="720"/>
+        </w:tabs>
+        <w:ind w:left="720" w:hanging="360"/>
+      </w:pPr>
+      <w:rPr>
+        <w:rFonts w:ascii="Symbol" w:hAnsi="Symbol" w:hint="default"/>
+        <w:sz w:val="20"/>
+      </w:rPr>
+    </w:lvl>
+    <w:lvl w:ilvl="1" w:tentative="1">
+      <w:start w:val="1"/>
+      <w:numFmt w:val="bullet"/>
+      <w:lvlText w:val="o"/>
+      <w:lvlJc w:val="left"/>
+      <w:pPr>
+        <w:tabs>
+          <w:tab w:val="num" w:pos="1440"/>
+        </w:tabs>
+        <w:ind w:left="1440" w:hanging="360"/>
+      </w:pPr>
+      <w:rPr>
+        <w:rFonts w:ascii="Courier New" w:hAnsi="Courier New" w:hint="default"/>
+        <w:sz w:val="20"/>
+      </w:rPr>
+    </w:lvl>
+    <w:lvl w:ilvl="2" w:tentative="1">
+      <w:start w:val="1"/>
+      <w:numFmt w:val="bullet"/>
+      <w:lvlText w:val=""/>
+      <w:lvlJc w:val="left"/>
+      <w:pPr>
+        <w:tabs>
+          <w:tab w:val="num" w:pos="2160"/>
+        </w:tabs>
+        <w:ind w:left="2160" w:hanging="360"/>
+      </w:pPr>
+      <w:rPr>
+        <w:rFonts w:ascii="Wingdings" w:hAnsi="Wingdings" w:hint="default"/>
+        <w:sz w:val="20"/>
+      </w:rPr>
+    </w:lvl>
+    <w:lvl w:ilvl="3" w:tentative="1">
+      <w:start w:val="1"/>
+      <w:numFmt w:val="bullet"/>
+      <w:lvlText w:val=""/>
+      <w:lvlJc w:val="left"/>
+      <w:pPr>
+        <w:tabs>
+          <w:tab w:val="num" w:pos="2880"/>
+        </w:tabs>
+        <w:ind w:left="2880" w:hanging="360"/>
+      </w:pPr>
+      <w:rPr>
+        <w:rFonts w:ascii="Wingdings" w:hAnsi="Wingdings" w:hint="default"/>
+        <w:sz w:val="20"/>
+      </w:rPr>
+    </w:lvl>
+    <w:lvl w:ilvl="4" w:tentative="1">
+      <w:start w:val="1"/>
+      <w:numFmt w:val="bullet"/>
+      <w:lvlText w:val=""/>
+      <w:lvlJc w:val="left"/>
+      <w:pPr>
+        <w:tabs>
+          <w:tab w:val="num" w:pos="3600"/>
+        </w:tabs>
+        <w:ind w:left="3600" w:hanging="360"/>
+      </w:pPr>
+      <w:rPr>
+        <w:rFonts w:ascii="Wingdings" w:hAnsi="Wingdings" w:hint="default"/>
+        <w:sz w:val="20"/>
+      </w:rPr>
+    </w:lvl>
+    <w:lvl w:ilvl="5" w:tentative="1">
+      <w:start w:val="1"/>
+      <w:numFmt w:val="bullet"/>
+      <w:lvlText w:val=""/>
+      <w:lvlJc w:val="left"/>
+      <w:pPr>
+        <w:tabs>
+          <w:tab w:val="num" w:pos="4320"/>
+        </w:tabs>
+        <w:ind w:left="4320" w:hanging="360"/>
+      </w:pPr>
+      <w:rPr>
+        <w:rFonts w:ascii="Wingdings" w:hAnsi="Wingdings" w:hint="default"/>
+        <w:sz w:val="20"/>
+      </w:rPr>
+    </w:lvl>
+    <w:lvl w:ilvl="6" w:tentative="1">
+      <w:start w:val="1"/>
+      <w:numFmt w:val="bullet"/>
+      <w:lvlText w:val=""/>
+      <w:lvlJc w:val="left"/>
+      <w:pPr>
+        <w:tabs>
+          <w:tab w:val="num" w:pos="5040"/>
+        </w:tabs>
+        <w:ind w:left="5040" w:hanging="360"/>
+      </w:pPr>
+      <w:rPr>
+        <w:rFonts w:ascii="Wingdings" w:hAnsi="Wingdings" w:hint="default"/>
+        <w:sz w:val="20"/>
+      </w:rPr>
+    </w:lvl>
+    <w:lvl w:ilvl="7" w:tentative="1">
+      <w:start w:val="1"/>
+      <w:numFmt w:val="bullet"/>
+      <w:lvlText w:val=""/>
+      <w:lvlJc w:val="left"/>
+      <w:pPr>
+        <w:tabs>
+          <w:tab w:val="num" w:pos="5760"/>
+        </w:tabs>
+        <w:ind w:left="5760" w:hanging="360"/>
+      </w:pPr>
+      <w:rPr>
+        <w:rFonts w:ascii="Wingdings" w:hAnsi="Wingdings" w:hint="default"/>
+        <w:sz w:val="20"/>
+      </w:rPr>
+    </w:lvl>
+    <w:lvl w:ilvl="8" w:tentative="1">
+      <w:start w:val="1"/>
+      <w:numFmt w:val="bullet"/>
+      <w:lvlText w:val=""/>
+      <w:lvlJc w:val="left"/>
+      <w:pPr>
+        <w:tabs>
+          <w:tab w:val="num" w:pos="6480"/>
+        </w:tabs>
+        <w:ind w:left="6480" w:hanging="360"/>
+      </w:pPr>
+      <w:rPr>
+        <w:rFonts w:ascii="Wingdings" w:hAnsi="Wingdings" w:hint="default"/>
+        <w:sz w:val="20"/>
+      </w:rPr>
+    </w:lvl>
+  </w:abstractNum>
+  <w:abstractNum w:abstractNumId="4" w15:restartNumberingAfterBreak="0">
+    <w:nsid w:val="688F0CDD"/>
+    <w:multiLevelType w:val="multilevel"/>
+    <w:tmpl w:val="5C7C6640"/>
+    <w:lvl w:ilvl="0">
+      <w:start w:val="1"/>
+      <w:numFmt w:val="bullet"/>
+      <w:lvlText w:val=""/>
+      <w:lvlJc w:val="left"/>
+      <w:pPr>
+        <w:tabs>
+          <w:tab w:val="num" w:pos="720"/>
+        </w:tabs>
+        <w:ind w:left="720" w:hanging="360"/>
+      </w:pPr>
+      <w:rPr>
+        <w:rFonts w:ascii="Symbol" w:hAnsi="Symbol" w:hint="default"/>
+        <w:sz w:val="20"/>
+      </w:rPr>
+    </w:lvl>
+    <w:lvl w:ilvl="1" w:tentative="1">
+      <w:start w:val="1"/>
+      <w:numFmt w:val="bullet"/>
+      <w:lvlText w:val="o"/>
+      <w:lvlJc w:val="left"/>
+      <w:pPr>
+        <w:tabs>
+          <w:tab w:val="num" w:pos="1440"/>
+        </w:tabs>
+        <w:ind w:left="1440" w:hanging="360"/>
+      </w:pPr>
+      <w:rPr>
+        <w:rFonts w:ascii="Courier New" w:hAnsi="Courier New" w:hint="default"/>
+        <w:sz w:val="20"/>
+      </w:rPr>
+    </w:lvl>
+    <w:lvl w:ilvl="2" w:tentative="1">
+      <w:start w:val="1"/>
+      <w:numFmt w:val="bullet"/>
+      <w:lvlText w:val=""/>
+      <w:lvlJc w:val="left"/>
+      <w:pPr>
+        <w:tabs>
+          <w:tab w:val="num" w:pos="2160"/>
+        </w:tabs>
+        <w:ind w:left="2160" w:hanging="360"/>
+      </w:pPr>
+      <w:rPr>
+        <w:rFonts w:ascii="Wingdings" w:hAnsi="Wingdings" w:hint="default"/>
+        <w:sz w:val="20"/>
+      </w:rPr>
+    </w:lvl>
+    <w:lvl w:ilvl="3" w:tentative="1">
+      <w:start w:val="1"/>
+      <w:numFmt w:val="bullet"/>
+      <w:lvlText w:val=""/>
+      <w:lvlJc w:val="left"/>
+      <w:pPr>
+        <w:tabs>
+          <w:tab w:val="num" w:pos="2880"/>
+        </w:tabs>
+        <w:ind w:left="2880" w:hanging="360"/>
+      </w:pPr>
+      <w:rPr>
+        <w:rFonts w:ascii="Wingdings" w:hAnsi="Wingdings" w:hint="default"/>
+        <w:sz w:val="20"/>
+      </w:rPr>
+    </w:lvl>
+    <w:lvl w:ilvl="4" w:tentative="1">
+      <w:start w:val="1"/>
+      <w:numFmt w:val="bullet"/>
+      <w:lvlText w:val=""/>
+      <w:lvlJc w:val="left"/>
+      <w:pPr>
+        <w:tabs>
+          <w:tab w:val="num" w:pos="3600"/>
+        </w:tabs>
+        <w:ind w:left="3600" w:hanging="360"/>
+      </w:pPr>
+      <w:rPr>
+        <w:rFonts w:ascii="Wingdings" w:hAnsi="Wingdings" w:hint="default"/>
+        <w:sz w:val="20"/>
+      </w:rPr>
+    </w:lvl>
+    <w:lvl w:ilvl="5" w:tentative="1">
+      <w:start w:val="1"/>
+      <w:numFmt w:val="bullet"/>
+      <w:lvlText w:val=""/>
+      <w:lvlJc w:val="left"/>
+      <w:pPr>
+        <w:tabs>
+          <w:tab w:val="num" w:pos="4320"/>
+        </w:tabs>
+        <w:ind w:left="4320" w:hanging="360"/>
+      </w:pPr>
+      <w:rPr>
+        <w:rFonts w:ascii="Wingdings" w:hAnsi="Wingdings" w:hint="default"/>
+        <w:sz w:val="20"/>
+      </w:rPr>
+    </w:lvl>
+    <w:lvl w:ilvl="6" w:tentative="1">
+      <w:start w:val="1"/>
+      <w:numFmt w:val="bullet"/>
+      <w:lvlText w:val=""/>
+      <w:lvlJc w:val="left"/>
+      <w:pPr>
+        <w:tabs>
+          <w:tab w:val="num" w:pos="5040"/>
+        </w:tabs>
+        <w:ind w:left="5040" w:hanging="360"/>
+      </w:pPr>
+      <w:rPr>
+        <w:rFonts w:ascii="Wingdings" w:hAnsi="Wingdings" w:hint="default"/>
+        <w:sz w:val="20"/>
+      </w:rPr>
+    </w:lvl>
+    <w:lvl w:ilvl="7" w:tentative="1">
+      <w:start w:val="1"/>
+      <w:numFmt w:val="bullet"/>
+      <w:lvlText w:val=""/>
+      <w:lvlJc w:val="left"/>
+      <w:pPr>
+        <w:tabs>
+          <w:tab w:val="num" w:pos="5760"/>
+        </w:tabs>
+        <w:ind w:left="5760" w:hanging="360"/>
+      </w:pPr>
+      <w:rPr>
+        <w:rFonts w:ascii="Wingdings" w:hAnsi="Wingdings" w:hint="default"/>
+        <w:sz w:val="20"/>
+      </w:rPr>
+    </w:lvl>
+    <w:lvl w:ilvl="8" w:tentative="1">
+      <w:start w:val="1"/>
+      <w:numFmt w:val="bullet"/>
+      <w:lvlText w:val=""/>
+      <w:lvlJc w:val="left"/>
+      <w:pPr>
+        <w:tabs>
+          <w:tab w:val="num" w:pos="6480"/>
+        </w:tabs>
+        <w:ind w:left="6480" w:hanging="360"/>
+      </w:pPr>
+      <w:rPr>
+        <w:rFonts w:ascii="Wingdings" w:hAnsi="Wingdings" w:hint="default"/>
+        <w:sz w:val="20"/>
+      </w:rPr>
+    </w:lvl>
+  </w:abstractNum>
   <w:num w:numId="1" w16cid:durableId="530606671">
     <w:abstractNumId w:val="1"/>
     <w:lvlOverride w:ilvl="0">
@@ -4055,6 +6352,12 @@
   </w:num>
   <w:num w:numId="3" w16cid:durableId="1782412438">
     <w:abstractNumId w:val="2"/>
+  </w:num>
+  <w:num w:numId="4" w16cid:durableId="1960256401">
+    <w:abstractNumId w:val="3"/>
+  </w:num>
+  <w:num w:numId="5" w16cid:durableId="485443154">
+    <w:abstractNumId w:val="4"/>
   </w:num>
 </w:numbering>
 </file>

</xml_diff>